<commit_message>
Transformer Models and Attention Mechanism
</commit_message>
<xml_diff>
--- a/Progress Report.docx
+++ b/Progress Report.docx
@@ -640,7 +640,7 @@
         </w:rPr>
         <w:fldChar w:fldCharType="separate"/>
       </w:r>
-      <w:hyperlink w:anchor="_Toc233376578" w:history="1">
+      <w:hyperlink w:anchor="_Toc233464129" w:history="1">
         <w:r>
           <w:rPr>
             <w:rStyle w:val="Hyperlink"/>
@@ -667,7 +667,7 @@
             <w:noProof/>
             <w:webHidden/>
           </w:rPr>
-          <w:instrText xml:space="preserve"> PAGEREF _Toc233376578 \h </w:instrText>
+          <w:instrText xml:space="preserve"> PAGEREF _Toc233464129 \h </w:instrText>
         </w:r>
         <w:r>
           <w:rPr>
@@ -710,7 +710,7 @@
           <w:sz w:val="22"/>
         </w:rPr>
       </w:pPr>
-      <w:hyperlink w:anchor="_Toc233376579" w:history="1">
+      <w:hyperlink w:anchor="_Toc233464130" w:history="1">
         <w:r>
           <w:rPr>
             <w:rStyle w:val="Hyperlink"/>
@@ -737,7 +737,7 @@
             <w:noProof/>
             <w:webHidden/>
           </w:rPr>
-          <w:instrText xml:space="preserve"> PAGEREF _Toc233376579 \h </w:instrText>
+          <w:instrText xml:space="preserve"> PAGEREF _Toc233464130 \h </w:instrText>
         </w:r>
         <w:r>
           <w:rPr>
@@ -780,7 +780,7 @@
           <w:sz w:val="22"/>
         </w:rPr>
       </w:pPr>
-      <w:hyperlink w:anchor="_Toc233376580" w:history="1">
+      <w:hyperlink w:anchor="_Toc233464131" w:history="1">
         <w:r>
           <w:rPr>
             <w:rStyle w:val="Hyperlink"/>
@@ -807,7 +807,7 @@
             <w:noProof/>
             <w:webHidden/>
           </w:rPr>
-          <w:instrText xml:space="preserve"> PAGEREF _Toc233376580 \h </w:instrText>
+          <w:instrText xml:space="preserve"> PAGEREF _Toc233464131 \h </w:instrText>
         </w:r>
         <w:r>
           <w:rPr>
@@ -850,7 +850,7 @@
           <w:sz w:val="22"/>
         </w:rPr>
       </w:pPr>
-      <w:hyperlink w:anchor="_Toc233376581" w:history="1">
+      <w:hyperlink w:anchor="_Toc233464132" w:history="1">
         <w:r>
           <w:rPr>
             <w:rStyle w:val="Hyperlink"/>
@@ -877,7 +877,7 @@
             <w:noProof/>
             <w:webHidden/>
           </w:rPr>
-          <w:instrText xml:space="preserve"> PAGEREF _Toc233376581 \h </w:instrText>
+          <w:instrText xml:space="preserve"> PAGEREF _Toc233464132 \h </w:instrText>
         </w:r>
         <w:r>
           <w:rPr>
@@ -920,7 +920,7 @@
           <w:sz w:val="22"/>
         </w:rPr>
       </w:pPr>
-      <w:hyperlink w:anchor="_Toc233376582" w:history="1">
+      <w:hyperlink w:anchor="_Toc233464133" w:history="1">
         <w:r>
           <w:rPr>
             <w:rStyle w:val="Hyperlink"/>
@@ -947,7 +947,7 @@
             <w:noProof/>
             <w:webHidden/>
           </w:rPr>
-          <w:instrText xml:space="preserve"> PAGEREF _Toc233376582 \h </w:instrText>
+          <w:instrText xml:space="preserve"> PAGEREF _Toc233464133 \h </w:instrText>
         </w:r>
         <w:r>
           <w:rPr>
@@ -990,7 +990,7 @@
           <w:sz w:val="22"/>
         </w:rPr>
       </w:pPr>
-      <w:hyperlink w:anchor="_Toc233376583" w:history="1">
+      <w:hyperlink w:anchor="_Toc233464134" w:history="1">
         <w:r>
           <w:rPr>
             <w:rStyle w:val="Hyperlink"/>
@@ -1017,7 +1017,7 @@
             <w:noProof/>
             <w:webHidden/>
           </w:rPr>
-          <w:instrText xml:space="preserve"> PAGEREF _Toc233376583 \h </w:instrText>
+          <w:instrText xml:space="preserve"> PAGEREF _Toc233464134 \h </w:instrText>
         </w:r>
         <w:r>
           <w:rPr>
@@ -1060,7 +1060,7 @@
           <w:sz w:val="22"/>
         </w:rPr>
       </w:pPr>
-      <w:hyperlink w:anchor="_Toc233376584" w:history="1">
+      <w:hyperlink w:anchor="_Toc233464135" w:history="1">
         <w:r>
           <w:rPr>
             <w:rStyle w:val="Hyperlink"/>
@@ -1087,7 +1087,7 @@
             <w:noProof/>
             <w:webHidden/>
           </w:rPr>
-          <w:instrText xml:space="preserve"> PAGEREF _Toc233376584 \h </w:instrText>
+          <w:instrText xml:space="preserve"> PAGEREF _Toc233464135 \h </w:instrText>
         </w:r>
         <w:r>
           <w:rPr>
@@ -1131,7 +1131,7 @@
           <w:sz w:val="22"/>
         </w:rPr>
       </w:pPr>
-      <w:hyperlink w:anchor="_Toc233376585" w:history="1">
+      <w:hyperlink w:anchor="_Toc233464136" w:history="1">
         <w:r>
           <w:rPr>
             <w:rStyle w:val="Hyperlink"/>
@@ -1158,7 +1158,7 @@
             <w:noProof/>
             <w:webHidden/>
           </w:rPr>
-          <w:instrText xml:space="preserve"> PAGEREF _Toc233376585 \h </w:instrText>
+          <w:instrText xml:space="preserve"> PAGEREF _Toc233464136 \h </w:instrText>
         </w:r>
         <w:r>
           <w:rPr>
@@ -1201,7 +1201,7 @@
           <w:sz w:val="22"/>
         </w:rPr>
       </w:pPr>
-      <w:hyperlink w:anchor="_Toc233376586" w:history="1">
+      <w:hyperlink w:anchor="_Toc233464137" w:history="1">
         <w:r>
           <w:rPr>
             <w:rStyle w:val="Hyperlink"/>
@@ -1228,7 +1228,7 @@
             <w:noProof/>
             <w:webHidden/>
           </w:rPr>
-          <w:instrText xml:space="preserve"> PAGEREF _Toc233376586 \h </w:instrText>
+          <w:instrText xml:space="preserve"> PAGEREF _Toc233464137 \h </w:instrText>
         </w:r>
         <w:r>
           <w:rPr>
@@ -1272,7 +1272,7 @@
           <w:sz w:val="22"/>
         </w:rPr>
       </w:pPr>
-      <w:hyperlink w:anchor="_Toc233376587" w:history="1">
+      <w:hyperlink w:anchor="_Toc233464138" w:history="1">
         <w:r>
           <w:rPr>
             <w:rStyle w:val="Hyperlink"/>
@@ -1299,7 +1299,7 @@
             <w:noProof/>
             <w:webHidden/>
           </w:rPr>
-          <w:instrText xml:space="preserve"> PAGEREF _Toc233376587 \h </w:instrText>
+          <w:instrText xml:space="preserve"> PAGEREF _Toc233464138 \h </w:instrText>
         </w:r>
         <w:r>
           <w:rPr>
@@ -1343,7 +1343,7 @@
           <w:sz w:val="22"/>
         </w:rPr>
       </w:pPr>
-      <w:hyperlink w:anchor="_Toc233376588" w:history="1">
+      <w:hyperlink w:anchor="_Toc233464139" w:history="1">
         <w:r>
           <w:rPr>
             <w:rStyle w:val="Hyperlink"/>
@@ -1370,7 +1370,7 @@
             <w:noProof/>
             <w:webHidden/>
           </w:rPr>
-          <w:instrText xml:space="preserve"> PAGEREF _Toc233376588 \h </w:instrText>
+          <w:instrText xml:space="preserve"> PAGEREF _Toc233464139 \h </w:instrText>
         </w:r>
         <w:r>
           <w:rPr>
@@ -1414,7 +1414,7 @@
           <w:sz w:val="22"/>
         </w:rPr>
       </w:pPr>
-      <w:hyperlink w:anchor="_Toc233376589" w:history="1">
+      <w:hyperlink w:anchor="_Toc233464140" w:history="1">
         <w:r>
           <w:rPr>
             <w:rStyle w:val="Hyperlink"/>
@@ -1441,7 +1441,7 @@
             <w:noProof/>
             <w:webHidden/>
           </w:rPr>
-          <w:instrText xml:space="preserve"> PAGEREF _Toc233376589 \h </w:instrText>
+          <w:instrText xml:space="preserve"> PAGEREF _Toc233464140 \h </w:instrText>
         </w:r>
         <w:r>
           <w:rPr>
@@ -1484,7 +1484,7 @@
           <w:sz w:val="22"/>
         </w:rPr>
       </w:pPr>
-      <w:hyperlink w:anchor="_Toc233376590" w:history="1">
+      <w:hyperlink w:anchor="_Toc233464141" w:history="1">
         <w:r>
           <w:rPr>
             <w:rStyle w:val="Hyperlink"/>
@@ -1511,7 +1511,7 @@
             <w:noProof/>
             <w:webHidden/>
           </w:rPr>
-          <w:instrText xml:space="preserve"> PAGEREF _Toc233376590 \h </w:instrText>
+          <w:instrText xml:space="preserve"> PAGEREF _Toc233464141 \h </w:instrText>
         </w:r>
         <w:r>
           <w:rPr>
@@ -1554,7 +1554,7 @@
           <w:sz w:val="22"/>
         </w:rPr>
       </w:pPr>
-      <w:hyperlink w:anchor="_Toc233376591" w:history="1">
+      <w:hyperlink w:anchor="_Toc233464142" w:history="1">
         <w:r>
           <w:rPr>
             <w:rStyle w:val="Hyperlink"/>
@@ -1581,7 +1581,7 @@
             <w:noProof/>
             <w:webHidden/>
           </w:rPr>
-          <w:instrText xml:space="preserve"> PAGEREF _Toc233376591 \h </w:instrText>
+          <w:instrText xml:space="preserve"> PAGEREF _Toc233464142 \h </w:instrText>
         </w:r>
         <w:r>
           <w:rPr>
@@ -1624,7 +1624,7 @@
           <w:sz w:val="22"/>
         </w:rPr>
       </w:pPr>
-      <w:hyperlink w:anchor="_Toc233376592" w:history="1">
+      <w:hyperlink w:anchor="_Toc233464143" w:history="1">
         <w:r>
           <w:rPr>
             <w:rStyle w:val="Hyperlink"/>
@@ -1651,7 +1651,7 @@
             <w:noProof/>
             <w:webHidden/>
           </w:rPr>
-          <w:instrText xml:space="preserve"> PAGEREF _Toc233376592 \h </w:instrText>
+          <w:instrText xml:space="preserve"> PAGEREF _Toc233464143 \h </w:instrText>
         </w:r>
         <w:r>
           <w:rPr>
@@ -1694,7 +1694,7 @@
           <w:sz w:val="22"/>
         </w:rPr>
       </w:pPr>
-      <w:hyperlink w:anchor="_Toc233376593" w:history="1">
+      <w:hyperlink w:anchor="_Toc233464144" w:history="1">
         <w:r>
           <w:rPr>
             <w:rStyle w:val="Hyperlink"/>
@@ -1721,7 +1721,7 @@
             <w:noProof/>
             <w:webHidden/>
           </w:rPr>
-          <w:instrText xml:space="preserve"> PAGEREF _Toc233376593 \h </w:instrText>
+          <w:instrText xml:space="preserve"> PAGEREF _Toc233464144 \h </w:instrText>
         </w:r>
         <w:r>
           <w:rPr>
@@ -1765,7 +1765,7 @@
           <w:sz w:val="22"/>
         </w:rPr>
       </w:pPr>
-      <w:hyperlink w:anchor="_Toc233376594" w:history="1">
+      <w:hyperlink w:anchor="_Toc233464145" w:history="1">
         <w:r>
           <w:rPr>
             <w:rStyle w:val="Hyperlink"/>
@@ -1792,7 +1792,7 @@
             <w:noProof/>
             <w:webHidden/>
           </w:rPr>
-          <w:instrText xml:space="preserve"> PAGEREF _Toc233376594 \h </w:instrText>
+          <w:instrText xml:space="preserve"> PAGEREF _Toc233464145 \h </w:instrText>
         </w:r>
         <w:r>
           <w:rPr>
@@ -1835,7 +1835,7 @@
           <w:sz w:val="22"/>
         </w:rPr>
       </w:pPr>
-      <w:hyperlink w:anchor="_Toc233376595" w:history="1">
+      <w:hyperlink w:anchor="_Toc233464146" w:history="1">
         <w:r>
           <w:rPr>
             <w:rStyle w:val="Hyperlink"/>
@@ -1862,7 +1862,7 @@
             <w:noProof/>
             <w:webHidden/>
           </w:rPr>
-          <w:instrText xml:space="preserve"> PAGEREF _Toc233376595 \h </w:instrText>
+          <w:instrText xml:space="preserve"> PAGEREF _Toc233464146 \h </w:instrText>
         </w:r>
         <w:r>
           <w:rPr>
@@ -1905,7 +1905,7 @@
           <w:sz w:val="22"/>
         </w:rPr>
       </w:pPr>
-      <w:hyperlink w:anchor="_Toc233376596" w:history="1">
+      <w:hyperlink w:anchor="_Toc233464147" w:history="1">
         <w:r>
           <w:rPr>
             <w:rStyle w:val="Hyperlink"/>
@@ -1932,7 +1932,7 @@
             <w:noProof/>
             <w:webHidden/>
           </w:rPr>
-          <w:instrText xml:space="preserve"> PAGEREF _Toc233376596 \h </w:instrText>
+          <w:instrText xml:space="preserve"> PAGEREF _Toc233464147 \h </w:instrText>
         </w:r>
         <w:r>
           <w:rPr>
@@ -1975,7 +1975,7 @@
           <w:sz w:val="22"/>
         </w:rPr>
       </w:pPr>
-      <w:hyperlink w:anchor="_Toc233376597" w:history="1">
+      <w:hyperlink w:anchor="_Toc233464148" w:history="1">
         <w:r>
           <w:rPr>
             <w:rStyle w:val="Hyperlink"/>
@@ -2002,7 +2002,7 @@
             <w:noProof/>
             <w:webHidden/>
           </w:rPr>
-          <w:instrText xml:space="preserve"> PAGEREF _Toc233376597 \h </w:instrText>
+          <w:instrText xml:space="preserve"> PAGEREF _Toc233464148 \h </w:instrText>
         </w:r>
         <w:r>
           <w:rPr>
@@ -2045,7 +2045,7 @@
           <w:sz w:val="22"/>
         </w:rPr>
       </w:pPr>
-      <w:hyperlink w:anchor="_Toc233376598" w:history="1">
+      <w:hyperlink w:anchor="_Toc233464149" w:history="1">
         <w:r>
           <w:rPr>
             <w:rStyle w:val="Hyperlink"/>
@@ -2072,7 +2072,7 @@
             <w:noProof/>
             <w:webHidden/>
           </w:rPr>
-          <w:instrText xml:space="preserve"> PAGEREF _Toc233376598 \h </w:instrText>
+          <w:instrText xml:space="preserve"> PAGEREF _Toc233464149 \h </w:instrText>
         </w:r>
         <w:r>
           <w:rPr>
@@ -2115,7 +2115,7 @@
           <w:sz w:val="22"/>
         </w:rPr>
       </w:pPr>
-      <w:hyperlink w:anchor="_Toc233376599" w:history="1">
+      <w:hyperlink w:anchor="_Toc233464150" w:history="1">
         <w:r>
           <w:rPr>
             <w:rStyle w:val="Hyperlink"/>
@@ -2142,7 +2142,7 @@
             <w:noProof/>
             <w:webHidden/>
           </w:rPr>
-          <w:instrText xml:space="preserve"> PAGEREF _Toc233376599 \h </w:instrText>
+          <w:instrText xml:space="preserve"> PAGEREF _Toc233464150 \h </w:instrText>
         </w:r>
         <w:r>
           <w:rPr>
@@ -2186,7 +2186,7 @@
           <w:sz w:val="22"/>
         </w:rPr>
       </w:pPr>
-      <w:hyperlink w:anchor="_Toc233376600" w:history="1">
+      <w:hyperlink w:anchor="_Toc233464151" w:history="1">
         <w:r>
           <w:rPr>
             <w:rStyle w:val="Hyperlink"/>
@@ -2213,7 +2213,7 @@
             <w:noProof/>
             <w:webHidden/>
           </w:rPr>
-          <w:instrText xml:space="preserve"> PAGEREF _Toc233376600 \h </w:instrText>
+          <w:instrText xml:space="preserve"> PAGEREF _Toc233464151 \h </w:instrText>
         </w:r>
         <w:r>
           <w:rPr>
@@ -2256,7 +2256,7 @@
           <w:sz w:val="22"/>
         </w:rPr>
       </w:pPr>
-      <w:hyperlink w:anchor="_Toc233376601" w:history="1">
+      <w:hyperlink w:anchor="_Toc233464152" w:history="1">
         <w:r>
           <w:rPr>
             <w:rStyle w:val="Hyperlink"/>
@@ -2283,7 +2283,7 @@
             <w:noProof/>
             <w:webHidden/>
           </w:rPr>
-          <w:instrText xml:space="preserve"> PAGEREF _Toc233376601 \h </w:instrText>
+          <w:instrText xml:space="preserve"> PAGEREF _Toc233464152 \h </w:instrText>
         </w:r>
         <w:r>
           <w:rPr>
@@ -2327,7 +2327,7 @@
           <w:sz w:val="22"/>
         </w:rPr>
       </w:pPr>
-      <w:hyperlink w:anchor="_Toc233376602" w:history="1">
+      <w:hyperlink w:anchor="_Toc233464153" w:history="1">
         <w:r>
           <w:rPr>
             <w:rStyle w:val="Hyperlink"/>
@@ -2354,7 +2354,7 @@
             <w:noProof/>
             <w:webHidden/>
           </w:rPr>
-          <w:instrText xml:space="preserve"> PAGEREF _Toc233376602 \h </w:instrText>
+          <w:instrText xml:space="preserve"> PAGEREF _Toc233464153 \h </w:instrText>
         </w:r>
         <w:r>
           <w:rPr>
@@ -2398,7 +2398,7 @@
           <w:sz w:val="22"/>
         </w:rPr>
       </w:pPr>
-      <w:hyperlink w:anchor="_Toc233376603" w:history="1">
+      <w:hyperlink w:anchor="_Toc233464154" w:history="1">
         <w:r>
           <w:rPr>
             <w:rStyle w:val="Hyperlink"/>
@@ -2425,7 +2425,7 @@
             <w:noProof/>
             <w:webHidden/>
           </w:rPr>
-          <w:instrText xml:space="preserve"> PAGEREF _Toc233376603 \h </w:instrText>
+          <w:instrText xml:space="preserve"> PAGEREF _Toc233464154 \h </w:instrText>
         </w:r>
         <w:r>
           <w:rPr>
@@ -2468,7 +2468,7 @@
           <w:sz w:val="22"/>
         </w:rPr>
       </w:pPr>
-      <w:hyperlink w:anchor="_Toc233376604" w:history="1">
+      <w:hyperlink w:anchor="_Toc233464155" w:history="1">
         <w:r>
           <w:rPr>
             <w:rStyle w:val="Hyperlink"/>
@@ -2495,7 +2495,7 @@
             <w:noProof/>
             <w:webHidden/>
           </w:rPr>
-          <w:instrText xml:space="preserve"> PAGEREF _Toc233376604 \h </w:instrText>
+          <w:instrText xml:space="preserve"> PAGEREF _Toc233464155 \h </w:instrText>
         </w:r>
         <w:r>
           <w:rPr>
@@ -2539,7 +2539,7 @@
           <w:sz w:val="22"/>
         </w:rPr>
       </w:pPr>
-      <w:hyperlink w:anchor="_Toc233376605" w:history="1">
+      <w:hyperlink w:anchor="_Toc233464156" w:history="1">
         <w:r>
           <w:rPr>
             <w:rStyle w:val="Hyperlink"/>
@@ -2566,7 +2566,7 @@
             <w:noProof/>
             <w:webHidden/>
           </w:rPr>
-          <w:instrText xml:space="preserve"> PAGEREF _Toc233376605 \h </w:instrText>
+          <w:instrText xml:space="preserve"> PAGEREF _Toc233464156 \h </w:instrText>
         </w:r>
         <w:r>
           <w:rPr>
@@ -2610,7 +2610,7 @@
           <w:sz w:val="22"/>
         </w:rPr>
       </w:pPr>
-      <w:hyperlink w:anchor="_Toc233376606" w:history="1">
+      <w:hyperlink w:anchor="_Toc233464157" w:history="1">
         <w:r>
           <w:rPr>
             <w:rStyle w:val="Hyperlink"/>
@@ -2637,7 +2637,7 @@
             <w:noProof/>
             <w:webHidden/>
           </w:rPr>
-          <w:instrText xml:space="preserve"> PAGEREF _Toc233376606 \h </w:instrText>
+          <w:instrText xml:space="preserve"> PAGEREF _Toc233464157 \h </w:instrText>
         </w:r>
         <w:r>
           <w:rPr>
@@ -2681,7 +2681,7 @@
           <w:sz w:val="22"/>
         </w:rPr>
       </w:pPr>
-      <w:hyperlink w:anchor="_Toc233376607" w:history="1">
+      <w:hyperlink w:anchor="_Toc233464158" w:history="1">
         <w:r>
           <w:rPr>
             <w:rStyle w:val="Hyperlink"/>
@@ -2708,7 +2708,7 @@
             <w:noProof/>
             <w:webHidden/>
           </w:rPr>
-          <w:instrText xml:space="preserve"> PAGEREF _Toc233376607 \h </w:instrText>
+          <w:instrText xml:space="preserve"> PAGEREF _Toc233464158 \h </w:instrText>
         </w:r>
         <w:r>
           <w:rPr>
@@ -2752,7 +2752,7 @@
           <w:sz w:val="22"/>
         </w:rPr>
       </w:pPr>
-      <w:hyperlink w:anchor="_Toc233376608" w:history="1">
+      <w:hyperlink w:anchor="_Toc233464159" w:history="1">
         <w:r>
           <w:rPr>
             <w:rStyle w:val="Hyperlink"/>
@@ -2779,7 +2779,7 @@
             <w:noProof/>
             <w:webHidden/>
           </w:rPr>
-          <w:instrText xml:space="preserve"> PAGEREF _Toc233376608 \h </w:instrText>
+          <w:instrText xml:space="preserve"> PAGEREF _Toc233464159 \h </w:instrText>
         </w:r>
         <w:r>
           <w:rPr>
@@ -2823,7 +2823,7 @@
           <w:sz w:val="22"/>
         </w:rPr>
       </w:pPr>
-      <w:hyperlink w:anchor="_Toc233376609" w:history="1">
+      <w:hyperlink w:anchor="_Toc233464160" w:history="1">
         <w:r>
           <w:rPr>
             <w:rStyle w:val="Hyperlink"/>
@@ -2850,7 +2850,7 @@
             <w:noProof/>
             <w:webHidden/>
           </w:rPr>
-          <w:instrText xml:space="preserve"> PAGEREF _Toc233376609 \h </w:instrText>
+          <w:instrText xml:space="preserve"> PAGEREF _Toc233464160 \h </w:instrText>
         </w:r>
         <w:r>
           <w:rPr>
@@ -2893,7 +2893,7 @@
           <w:sz w:val="22"/>
         </w:rPr>
       </w:pPr>
-      <w:hyperlink w:anchor="_Toc233376610" w:history="1">
+      <w:hyperlink w:anchor="_Toc233464161" w:history="1">
         <w:r>
           <w:rPr>
             <w:rStyle w:val="Hyperlink"/>
@@ -2920,7 +2920,7 @@
             <w:noProof/>
             <w:webHidden/>
           </w:rPr>
-          <w:instrText xml:space="preserve"> PAGEREF _Toc233376610 \h </w:instrText>
+          <w:instrText xml:space="preserve"> PAGEREF _Toc233464161 \h </w:instrText>
         </w:r>
         <w:r>
           <w:rPr>
@@ -2964,7 +2964,7 @@
           <w:sz w:val="22"/>
         </w:rPr>
       </w:pPr>
-      <w:hyperlink w:anchor="_Toc233376611" w:history="1">
+      <w:hyperlink w:anchor="_Toc233464162" w:history="1">
         <w:r>
           <w:rPr>
             <w:rStyle w:val="Hyperlink"/>
@@ -2991,7 +2991,7 @@
             <w:noProof/>
             <w:webHidden/>
           </w:rPr>
-          <w:instrText xml:space="preserve"> PAGEREF _Toc233376611 \h </w:instrText>
+          <w:instrText xml:space="preserve"> PAGEREF _Toc233464162 \h </w:instrText>
         </w:r>
         <w:r>
           <w:rPr>
@@ -3035,7 +3035,7 @@
           <w:sz w:val="22"/>
         </w:rPr>
       </w:pPr>
-      <w:hyperlink w:anchor="_Toc233376612" w:history="1">
+      <w:hyperlink w:anchor="_Toc233464163" w:history="1">
         <w:r>
           <w:rPr>
             <w:rStyle w:val="Hyperlink"/>
@@ -3062,7 +3062,7 @@
             <w:noProof/>
             <w:webHidden/>
           </w:rPr>
-          <w:instrText xml:space="preserve"> PAGEREF _Toc233376612 \h </w:instrText>
+          <w:instrText xml:space="preserve"> PAGEREF _Toc233464163 \h </w:instrText>
         </w:r>
         <w:r>
           <w:rPr>
@@ -3105,7 +3105,7 @@
           <w:sz w:val="22"/>
         </w:rPr>
       </w:pPr>
-      <w:hyperlink w:anchor="_Toc233376613" w:history="1">
+      <w:hyperlink w:anchor="_Toc233464164" w:history="1">
         <w:r>
           <w:rPr>
             <w:rStyle w:val="Hyperlink"/>
@@ -3132,7 +3132,7 @@
             <w:noProof/>
             <w:webHidden/>
           </w:rPr>
-          <w:instrText xml:space="preserve"> PAGEREF _Toc233376613 \h </w:instrText>
+          <w:instrText xml:space="preserve"> PAGEREF _Toc233464164 \h </w:instrText>
         </w:r>
         <w:r>
           <w:rPr>
@@ -3176,7 +3176,7 @@
           <w:sz w:val="22"/>
         </w:rPr>
       </w:pPr>
-      <w:hyperlink w:anchor="_Toc233376614" w:history="1">
+      <w:hyperlink w:anchor="_Toc233464165" w:history="1">
         <w:r>
           <w:rPr>
             <w:rStyle w:val="Hyperlink"/>
@@ -3203,7 +3203,7 @@
             <w:noProof/>
             <w:webHidden/>
           </w:rPr>
-          <w:instrText xml:space="preserve"> PAGEREF _Toc233376614 \h </w:instrText>
+          <w:instrText xml:space="preserve"> PAGEREF _Toc233464165 \h </w:instrText>
         </w:r>
         <w:r>
           <w:rPr>
@@ -3246,7 +3246,7 @@
           <w:sz w:val="22"/>
         </w:rPr>
       </w:pPr>
-      <w:hyperlink w:anchor="_Toc233376615" w:history="1">
+      <w:hyperlink w:anchor="_Toc233464166" w:history="1">
         <w:r>
           <w:rPr>
             <w:rStyle w:val="Hyperlink"/>
@@ -3273,7 +3273,7 @@
             <w:noProof/>
             <w:webHidden/>
           </w:rPr>
-          <w:instrText xml:space="preserve"> PAGEREF _Toc233376615 \h </w:instrText>
+          <w:instrText xml:space="preserve"> PAGEREF _Toc233464166 \h </w:instrText>
         </w:r>
         <w:r>
           <w:rPr>
@@ -3316,7 +3316,7 @@
           <w:sz w:val="22"/>
         </w:rPr>
       </w:pPr>
-      <w:hyperlink w:anchor="_Toc233376616" w:history="1">
+      <w:hyperlink w:anchor="_Toc233464167" w:history="1">
         <w:r>
           <w:rPr>
             <w:rStyle w:val="Hyperlink"/>
@@ -3343,7 +3343,7 @@
             <w:noProof/>
             <w:webHidden/>
           </w:rPr>
-          <w:instrText xml:space="preserve"> PAGEREF _Toc233376616 \h </w:instrText>
+          <w:instrText xml:space="preserve"> PAGEREF _Toc233464167 \h </w:instrText>
         </w:r>
         <w:r>
           <w:rPr>
@@ -3386,7 +3386,7 @@
           <w:sz w:val="22"/>
         </w:rPr>
       </w:pPr>
-      <w:hyperlink w:anchor="_Toc233376617" w:history="1">
+      <w:hyperlink w:anchor="_Toc233464168" w:history="1">
         <w:r>
           <w:rPr>
             <w:rStyle w:val="Hyperlink"/>
@@ -3413,7 +3413,7 @@
             <w:noProof/>
             <w:webHidden/>
           </w:rPr>
-          <w:instrText xml:space="preserve"> PAGEREF _Toc233376617 \h </w:instrText>
+          <w:instrText xml:space="preserve"> PAGEREF _Toc233464168 \h </w:instrText>
         </w:r>
         <w:r>
           <w:rPr>
@@ -3457,7 +3457,7 @@
           <w:sz w:val="22"/>
         </w:rPr>
       </w:pPr>
-      <w:hyperlink w:anchor="_Toc233376618" w:history="1">
+      <w:hyperlink w:anchor="_Toc233464169" w:history="1">
         <w:r>
           <w:rPr>
             <w:rStyle w:val="Hyperlink"/>
@@ -3484,7 +3484,7 @@
             <w:noProof/>
             <w:webHidden/>
           </w:rPr>
-          <w:instrText xml:space="preserve"> PAGEREF _Toc233376618 \h </w:instrText>
+          <w:instrText xml:space="preserve"> PAGEREF _Toc233464169 \h </w:instrText>
         </w:r>
         <w:r>
           <w:rPr>
@@ -3528,7 +3528,7 @@
           <w:sz w:val="22"/>
         </w:rPr>
       </w:pPr>
-      <w:hyperlink w:anchor="_Toc233376619" w:history="1">
+      <w:hyperlink w:anchor="_Toc233464170" w:history="1">
         <w:r>
           <w:rPr>
             <w:rStyle w:val="Hyperlink"/>
@@ -3555,7 +3555,7 @@
             <w:noProof/>
             <w:webHidden/>
           </w:rPr>
-          <w:instrText xml:space="preserve"> PAGEREF _Toc233376619 \h </w:instrText>
+          <w:instrText xml:space="preserve"> PAGEREF _Toc233464170 \h </w:instrText>
         </w:r>
         <w:r>
           <w:rPr>
@@ -3599,7 +3599,7 @@
           <w:sz w:val="22"/>
         </w:rPr>
       </w:pPr>
-      <w:hyperlink w:anchor="_Toc233376620" w:history="1">
+      <w:hyperlink w:anchor="_Toc233464171" w:history="1">
         <w:r>
           <w:rPr>
             <w:rStyle w:val="Hyperlink"/>
@@ -3626,7 +3626,7 @@
             <w:noProof/>
             <w:webHidden/>
           </w:rPr>
-          <w:instrText xml:space="preserve"> PAGEREF _Toc233376620 \h </w:instrText>
+          <w:instrText xml:space="preserve"> PAGEREF _Toc233464171 \h </w:instrText>
         </w:r>
         <w:r>
           <w:rPr>
@@ -3669,7 +3669,7 @@
           <w:sz w:val="22"/>
         </w:rPr>
       </w:pPr>
-      <w:hyperlink w:anchor="_Toc233376621" w:history="1">
+      <w:hyperlink w:anchor="_Toc233464172" w:history="1">
         <w:r>
           <w:rPr>
             <w:rStyle w:val="Hyperlink"/>
@@ -3696,7 +3696,7 @@
             <w:noProof/>
             <w:webHidden/>
           </w:rPr>
-          <w:instrText xml:space="preserve"> PAGEREF _Toc233376621 \h </w:instrText>
+          <w:instrText xml:space="preserve"> PAGEREF _Toc233464172 \h </w:instrText>
         </w:r>
         <w:r>
           <w:rPr>
@@ -3740,7 +3740,7 @@
           <w:sz w:val="22"/>
         </w:rPr>
       </w:pPr>
-      <w:hyperlink w:anchor="_Toc233376622" w:history="1">
+      <w:hyperlink w:anchor="_Toc233464173" w:history="1">
         <w:r>
           <w:rPr>
             <w:rStyle w:val="Hyperlink"/>
@@ -3767,7 +3767,7 @@
             <w:noProof/>
             <w:webHidden/>
           </w:rPr>
-          <w:instrText xml:space="preserve"> PAGEREF _Toc233376622 \h </w:instrText>
+          <w:instrText xml:space="preserve"> PAGEREF _Toc233464173 \h </w:instrText>
         </w:r>
         <w:r>
           <w:rPr>
@@ -3811,7 +3811,7 @@
           <w:sz w:val="22"/>
         </w:rPr>
       </w:pPr>
-      <w:hyperlink w:anchor="_Toc233376623" w:history="1">
+      <w:hyperlink w:anchor="_Toc233464174" w:history="1">
         <w:r>
           <w:rPr>
             <w:rStyle w:val="Hyperlink"/>
@@ -3838,7 +3838,7 @@
             <w:noProof/>
             <w:webHidden/>
           </w:rPr>
-          <w:instrText xml:space="preserve"> PAGEREF _Toc233376623 \h </w:instrText>
+          <w:instrText xml:space="preserve"> PAGEREF _Toc233464174 \h </w:instrText>
         </w:r>
         <w:r>
           <w:rPr>
@@ -3882,7 +3882,7 @@
           <w:sz w:val="22"/>
         </w:rPr>
       </w:pPr>
-      <w:hyperlink w:anchor="_Toc233376624" w:history="1">
+      <w:hyperlink w:anchor="_Toc233464175" w:history="1">
         <w:r>
           <w:rPr>
             <w:rStyle w:val="Hyperlink"/>
@@ -3909,7 +3909,7 @@
             <w:noProof/>
             <w:webHidden/>
           </w:rPr>
-          <w:instrText xml:space="preserve"> PAGEREF _Toc233376624 \h </w:instrText>
+          <w:instrText xml:space="preserve"> PAGEREF _Toc233464175 \h </w:instrText>
         </w:r>
         <w:r>
           <w:rPr>
@@ -3953,7 +3953,7 @@
           <w:sz w:val="22"/>
         </w:rPr>
       </w:pPr>
-      <w:hyperlink w:anchor="_Toc233376625" w:history="1">
+      <w:hyperlink w:anchor="_Toc233464176" w:history="1">
         <w:r>
           <w:rPr>
             <w:rStyle w:val="Hyperlink"/>
@@ -3980,7 +3980,7 @@
             <w:noProof/>
             <w:webHidden/>
           </w:rPr>
-          <w:instrText xml:space="preserve"> PAGEREF _Toc233376625 \h </w:instrText>
+          <w:instrText xml:space="preserve"> PAGEREF _Toc233464176 \h </w:instrText>
         </w:r>
         <w:r>
           <w:rPr>
@@ -4023,7 +4023,7 @@
           <w:sz w:val="22"/>
         </w:rPr>
       </w:pPr>
-      <w:hyperlink w:anchor="_Toc233376626" w:history="1">
+      <w:hyperlink w:anchor="_Toc233464177" w:history="1">
         <w:r>
           <w:rPr>
             <w:rStyle w:val="Hyperlink"/>
@@ -4050,7 +4050,7 @@
             <w:noProof/>
             <w:webHidden/>
           </w:rPr>
-          <w:instrText xml:space="preserve"> PAGEREF _Toc233376626 \h </w:instrText>
+          <w:instrText xml:space="preserve"> PAGEREF _Toc233464177 \h </w:instrText>
         </w:r>
         <w:r>
           <w:rPr>
@@ -4093,7 +4093,7 @@
           <w:sz w:val="22"/>
         </w:rPr>
       </w:pPr>
-      <w:hyperlink w:anchor="_Toc233376627" w:history="1">
+      <w:hyperlink w:anchor="_Toc233464178" w:history="1">
         <w:r>
           <w:rPr>
             <w:rStyle w:val="Hyperlink"/>
@@ -4120,7 +4120,7 @@
             <w:noProof/>
             <w:webHidden/>
           </w:rPr>
-          <w:instrText xml:space="preserve"> PAGEREF _Toc233376627 \h </w:instrText>
+          <w:instrText xml:space="preserve"> PAGEREF _Toc233464178 \h </w:instrText>
         </w:r>
         <w:r>
           <w:rPr>
@@ -4163,7 +4163,7 @@
           <w:sz w:val="22"/>
         </w:rPr>
       </w:pPr>
-      <w:hyperlink w:anchor="_Toc233376628" w:history="1">
+      <w:hyperlink w:anchor="_Toc233464179" w:history="1">
         <w:r>
           <w:rPr>
             <w:rStyle w:val="Hyperlink"/>
@@ -4190,7 +4190,7 @@
             <w:noProof/>
             <w:webHidden/>
           </w:rPr>
-          <w:instrText xml:space="preserve"> PAGEREF _Toc233376628 \h </w:instrText>
+          <w:instrText xml:space="preserve"> PAGEREF _Toc233464179 \h </w:instrText>
         </w:r>
         <w:r>
           <w:rPr>
@@ -4233,7 +4233,7 @@
           <w:sz w:val="22"/>
         </w:rPr>
       </w:pPr>
-      <w:hyperlink w:anchor="_Toc233376629" w:history="1">
+      <w:hyperlink w:anchor="_Toc233464180" w:history="1">
         <w:r>
           <w:rPr>
             <w:rStyle w:val="Hyperlink"/>
@@ -4260,7 +4260,7 @@
             <w:noProof/>
             <w:webHidden/>
           </w:rPr>
-          <w:instrText xml:space="preserve"> PAGEREF _Toc233376629 \h </w:instrText>
+          <w:instrText xml:space="preserve"> PAGEREF _Toc233464180 \h </w:instrText>
         </w:r>
         <w:r>
           <w:rPr>
@@ -4304,7 +4304,7 @@
           <w:sz w:val="22"/>
         </w:rPr>
       </w:pPr>
-      <w:hyperlink w:anchor="_Toc233376630" w:history="1">
+      <w:hyperlink w:anchor="_Toc233464181" w:history="1">
         <w:r>
           <w:rPr>
             <w:rStyle w:val="Hyperlink"/>
@@ -4331,7 +4331,7 @@
             <w:noProof/>
             <w:webHidden/>
           </w:rPr>
-          <w:instrText xml:space="preserve"> PAGEREF _Toc233376630 \h </w:instrText>
+          <w:instrText xml:space="preserve"> PAGEREF _Toc233464181 \h </w:instrText>
         </w:r>
         <w:r>
           <w:rPr>
@@ -4375,7 +4375,7 @@
           <w:sz w:val="22"/>
         </w:rPr>
       </w:pPr>
-      <w:hyperlink w:anchor="_Toc233376631" w:history="1">
+      <w:hyperlink w:anchor="_Toc233464182" w:history="1">
         <w:r>
           <w:rPr>
             <w:rStyle w:val="Hyperlink"/>
@@ -4402,7 +4402,7 @@
             <w:noProof/>
             <w:webHidden/>
           </w:rPr>
-          <w:instrText xml:space="preserve"> PAGEREF _Toc233376631 \h </w:instrText>
+          <w:instrText xml:space="preserve"> PAGEREF _Toc233464182 \h </w:instrText>
         </w:r>
         <w:r>
           <w:rPr>
@@ -4423,6 +4423,430 @@
             <w:webHidden/>
           </w:rPr>
           <w:t>24</w:t>
+        </w:r>
+        <w:r>
+          <w:rPr>
+            <w:noProof/>
+            <w:webHidden/>
+          </w:rPr>
+          <w:fldChar w:fldCharType="end"/>
+        </w:r>
+      </w:hyperlink>
+    </w:p>
+    <w:p>
+      <w:pPr>
+        <w:pStyle w:val="TOC1"/>
+        <w:tabs>
+          <w:tab w:val="right" w:leader="dot" w:pos="9350"/>
+        </w:tabs>
+        <w:rPr>
+          <w:rFonts w:asciiTheme="minorHAnsi" w:eastAsiaTheme="minorEastAsia" w:hAnsiTheme="minorHAnsi"/>
+          <w:b w:val="0"/>
+          <w:noProof/>
+          <w:sz w:val="22"/>
+        </w:rPr>
+      </w:pPr>
+      <w:hyperlink w:anchor="_Toc233464183" w:history="1">
+        <w:r>
+          <w:rPr>
+            <w:rStyle w:val="Hyperlink"/>
+            <w:noProof/>
+          </w:rPr>
+          <w:t>WEEK 8: TRANSFORMER MODELS AND ATTENTION MECHANISMS</w:t>
+        </w:r>
+        <w:r>
+          <w:rPr>
+            <w:noProof/>
+            <w:webHidden/>
+          </w:rPr>
+          <w:tab/>
+        </w:r>
+        <w:r>
+          <w:rPr>
+            <w:noProof/>
+            <w:webHidden/>
+          </w:rPr>
+          <w:fldChar w:fldCharType="begin"/>
+        </w:r>
+        <w:r>
+          <w:rPr>
+            <w:noProof/>
+            <w:webHidden/>
+          </w:rPr>
+          <w:instrText xml:space="preserve"> PAGEREF _Toc233464183 \h </w:instrText>
+        </w:r>
+        <w:r>
+          <w:rPr>
+            <w:noProof/>
+            <w:webHidden/>
+          </w:rPr>
+        </w:r>
+        <w:r>
+          <w:rPr>
+            <w:noProof/>
+            <w:webHidden/>
+          </w:rPr>
+          <w:fldChar w:fldCharType="separate"/>
+        </w:r>
+        <w:r>
+          <w:rPr>
+            <w:noProof/>
+            <w:webHidden/>
+          </w:rPr>
+          <w:t>25</w:t>
+        </w:r>
+        <w:r>
+          <w:rPr>
+            <w:noProof/>
+            <w:webHidden/>
+          </w:rPr>
+          <w:fldChar w:fldCharType="end"/>
+        </w:r>
+      </w:hyperlink>
+    </w:p>
+    <w:p>
+      <w:pPr>
+        <w:pStyle w:val="TOC2"/>
+        <w:tabs>
+          <w:tab w:val="right" w:leader="dot" w:pos="9350"/>
+        </w:tabs>
+        <w:rPr>
+          <w:rFonts w:asciiTheme="minorHAnsi" w:eastAsiaTheme="minorEastAsia" w:hAnsiTheme="minorHAnsi"/>
+          <w:noProof/>
+          <w:sz w:val="22"/>
+        </w:rPr>
+      </w:pPr>
+      <w:hyperlink w:anchor="_Toc233464184" w:history="1">
+        <w:r>
+          <w:rPr>
+            <w:rStyle w:val="Hyperlink"/>
+            <w:noProof/>
+          </w:rPr>
+          <w:t>8.1 Sentiment Analysis</w:t>
+        </w:r>
+        <w:r>
+          <w:rPr>
+            <w:noProof/>
+            <w:webHidden/>
+          </w:rPr>
+          <w:tab/>
+        </w:r>
+        <w:r>
+          <w:rPr>
+            <w:noProof/>
+            <w:webHidden/>
+          </w:rPr>
+          <w:fldChar w:fldCharType="begin"/>
+        </w:r>
+        <w:r>
+          <w:rPr>
+            <w:noProof/>
+            <w:webHidden/>
+          </w:rPr>
+          <w:instrText xml:space="preserve"> PAGEREF _Toc233464184 \h </w:instrText>
+        </w:r>
+        <w:r>
+          <w:rPr>
+            <w:noProof/>
+            <w:webHidden/>
+          </w:rPr>
+        </w:r>
+        <w:r>
+          <w:rPr>
+            <w:noProof/>
+            <w:webHidden/>
+          </w:rPr>
+          <w:fldChar w:fldCharType="separate"/>
+        </w:r>
+        <w:r>
+          <w:rPr>
+            <w:noProof/>
+            <w:webHidden/>
+          </w:rPr>
+          <w:t>25</w:t>
+        </w:r>
+        <w:r>
+          <w:rPr>
+            <w:noProof/>
+            <w:webHidden/>
+          </w:rPr>
+          <w:fldChar w:fldCharType="end"/>
+        </w:r>
+      </w:hyperlink>
+    </w:p>
+    <w:p>
+      <w:pPr>
+        <w:pStyle w:val="TOC3"/>
+        <w:tabs>
+          <w:tab w:val="right" w:leader="dot" w:pos="9350"/>
+        </w:tabs>
+        <w:rPr>
+          <w:rFonts w:asciiTheme="minorHAnsi" w:eastAsiaTheme="minorEastAsia" w:hAnsiTheme="minorHAnsi"/>
+          <w:i w:val="0"/>
+          <w:noProof/>
+          <w:sz w:val="22"/>
+        </w:rPr>
+      </w:pPr>
+      <w:hyperlink w:anchor="_Toc233464185" w:history="1">
+        <w:r>
+          <w:rPr>
+            <w:rStyle w:val="Hyperlink"/>
+            <w:noProof/>
+          </w:rPr>
+          <w:t>8.1.1 Positive Review</w:t>
+        </w:r>
+        <w:r>
+          <w:rPr>
+            <w:noProof/>
+            <w:webHidden/>
+          </w:rPr>
+          <w:tab/>
+        </w:r>
+        <w:r>
+          <w:rPr>
+            <w:noProof/>
+            <w:webHidden/>
+          </w:rPr>
+          <w:fldChar w:fldCharType="begin"/>
+        </w:r>
+        <w:r>
+          <w:rPr>
+            <w:noProof/>
+            <w:webHidden/>
+          </w:rPr>
+          <w:instrText xml:space="preserve"> PAGEREF _Toc233464185 \h </w:instrText>
+        </w:r>
+        <w:r>
+          <w:rPr>
+            <w:noProof/>
+            <w:webHidden/>
+          </w:rPr>
+        </w:r>
+        <w:r>
+          <w:rPr>
+            <w:noProof/>
+            <w:webHidden/>
+          </w:rPr>
+          <w:fldChar w:fldCharType="separate"/>
+        </w:r>
+        <w:r>
+          <w:rPr>
+            <w:noProof/>
+            <w:webHidden/>
+          </w:rPr>
+          <w:t>25</w:t>
+        </w:r>
+        <w:r>
+          <w:rPr>
+            <w:noProof/>
+            <w:webHidden/>
+          </w:rPr>
+          <w:fldChar w:fldCharType="end"/>
+        </w:r>
+      </w:hyperlink>
+    </w:p>
+    <w:p>
+      <w:pPr>
+        <w:pStyle w:val="TOC3"/>
+        <w:tabs>
+          <w:tab w:val="right" w:leader="dot" w:pos="9350"/>
+        </w:tabs>
+        <w:rPr>
+          <w:rFonts w:asciiTheme="minorHAnsi" w:eastAsiaTheme="minorEastAsia" w:hAnsiTheme="minorHAnsi"/>
+          <w:i w:val="0"/>
+          <w:noProof/>
+          <w:sz w:val="22"/>
+        </w:rPr>
+      </w:pPr>
+      <w:hyperlink w:anchor="_Toc233464186" w:history="1">
+        <w:r>
+          <w:rPr>
+            <w:rStyle w:val="Hyperlink"/>
+            <w:noProof/>
+          </w:rPr>
+          <w:t>8.1.2 Negative Review</w:t>
+        </w:r>
+        <w:r>
+          <w:rPr>
+            <w:noProof/>
+            <w:webHidden/>
+          </w:rPr>
+          <w:tab/>
+        </w:r>
+        <w:r>
+          <w:rPr>
+            <w:noProof/>
+            <w:webHidden/>
+          </w:rPr>
+          <w:fldChar w:fldCharType="begin"/>
+        </w:r>
+        <w:r>
+          <w:rPr>
+            <w:noProof/>
+            <w:webHidden/>
+          </w:rPr>
+          <w:instrText xml:space="preserve"> PAGEREF _Toc233464186 \h </w:instrText>
+        </w:r>
+        <w:r>
+          <w:rPr>
+            <w:noProof/>
+            <w:webHidden/>
+          </w:rPr>
+        </w:r>
+        <w:r>
+          <w:rPr>
+            <w:noProof/>
+            <w:webHidden/>
+          </w:rPr>
+          <w:fldChar w:fldCharType="separate"/>
+        </w:r>
+        <w:r>
+          <w:rPr>
+            <w:noProof/>
+            <w:webHidden/>
+          </w:rPr>
+          <w:t>25</w:t>
+        </w:r>
+        <w:r>
+          <w:rPr>
+            <w:noProof/>
+            <w:webHidden/>
+          </w:rPr>
+          <w:fldChar w:fldCharType="end"/>
+        </w:r>
+      </w:hyperlink>
+    </w:p>
+    <w:p>
+      <w:pPr>
+        <w:pStyle w:val="TOC3"/>
+        <w:tabs>
+          <w:tab w:val="right" w:leader="dot" w:pos="9350"/>
+        </w:tabs>
+        <w:rPr>
+          <w:rFonts w:asciiTheme="minorHAnsi" w:eastAsiaTheme="minorEastAsia" w:hAnsiTheme="minorHAnsi"/>
+          <w:i w:val="0"/>
+          <w:noProof/>
+          <w:sz w:val="22"/>
+        </w:rPr>
+      </w:pPr>
+      <w:hyperlink w:anchor="_Toc233464187" w:history="1">
+        <w:r>
+          <w:rPr>
+            <w:rStyle w:val="Hyperlink"/>
+            <w:noProof/>
+          </w:rPr>
+          <w:t>8.1.3 Neutral Review</w:t>
+        </w:r>
+        <w:r>
+          <w:rPr>
+            <w:noProof/>
+            <w:webHidden/>
+          </w:rPr>
+          <w:tab/>
+        </w:r>
+        <w:r>
+          <w:rPr>
+            <w:noProof/>
+            <w:webHidden/>
+          </w:rPr>
+          <w:fldChar w:fldCharType="begin"/>
+        </w:r>
+        <w:r>
+          <w:rPr>
+            <w:noProof/>
+            <w:webHidden/>
+          </w:rPr>
+          <w:instrText xml:space="preserve"> PAGEREF _Toc233464187 \h </w:instrText>
+        </w:r>
+        <w:r>
+          <w:rPr>
+            <w:noProof/>
+            <w:webHidden/>
+          </w:rPr>
+        </w:r>
+        <w:r>
+          <w:rPr>
+            <w:noProof/>
+            <w:webHidden/>
+          </w:rPr>
+          <w:fldChar w:fldCharType="separate"/>
+        </w:r>
+        <w:r>
+          <w:rPr>
+            <w:noProof/>
+            <w:webHidden/>
+          </w:rPr>
+          <w:t>25</w:t>
+        </w:r>
+        <w:r>
+          <w:rPr>
+            <w:noProof/>
+            <w:webHidden/>
+          </w:rPr>
+          <w:fldChar w:fldCharType="end"/>
+        </w:r>
+      </w:hyperlink>
+    </w:p>
+    <w:p>
+      <w:pPr>
+        <w:pStyle w:val="TOC2"/>
+        <w:tabs>
+          <w:tab w:val="right" w:leader="dot" w:pos="9350"/>
+        </w:tabs>
+        <w:rPr>
+          <w:rFonts w:asciiTheme="minorHAnsi" w:eastAsiaTheme="minorEastAsia" w:hAnsiTheme="minorHAnsi"/>
+          <w:noProof/>
+          <w:sz w:val="22"/>
+        </w:rPr>
+      </w:pPr>
+      <w:hyperlink w:anchor="_Toc233464188" w:history="1">
+        <w:r>
+          <w:rPr>
+            <w:rStyle w:val="Hyperlink"/>
+            <w:noProof/>
+          </w:rPr>
+          <w:t>8.2 Text Generation</w:t>
+        </w:r>
+        <w:r>
+          <w:rPr>
+            <w:noProof/>
+            <w:webHidden/>
+          </w:rPr>
+          <w:tab/>
+        </w:r>
+        <w:r>
+          <w:rPr>
+            <w:noProof/>
+            <w:webHidden/>
+          </w:rPr>
+          <w:fldChar w:fldCharType="begin"/>
+        </w:r>
+        <w:r>
+          <w:rPr>
+            <w:noProof/>
+            <w:webHidden/>
+          </w:rPr>
+          <w:instrText xml:space="preserve"> PAGEREF _Toc233464188 \h </w:instrText>
+        </w:r>
+        <w:r>
+          <w:rPr>
+            <w:noProof/>
+            <w:webHidden/>
+          </w:rPr>
+        </w:r>
+        <w:r>
+          <w:rPr>
+            <w:noProof/>
+            <w:webHidden/>
+          </w:rPr>
+          <w:fldChar w:fldCharType="separate"/>
+        </w:r>
+        <w:r>
+          <w:rPr>
+            <w:noProof/>
+            <w:webHidden/>
+          </w:rPr>
+          <w:t>26</w:t>
         </w:r>
         <w:r>
           <w:rPr>
@@ -4453,71 +4877,6 @@
         </w:rPr>
         <w:fldChar w:fldCharType="end"/>
       </w:r>
-    </w:p>
-    <w:p>
-      <w:pPr>
-        <w:spacing w:line="360" w:lineRule="auto"/>
-        <w:jc w:val="center"/>
-        <w:rPr>
-          <w:rFonts w:ascii="Times New Roman" w:hAnsi="Times New Roman" w:cs="Times New Roman"/>
-          <w:b/>
-          <w:bCs/>
-          <w:sz w:val="24"/>
-          <w:szCs w:val="24"/>
-        </w:rPr>
-      </w:pPr>
-    </w:p>
-    <w:p>
-      <w:pPr>
-        <w:spacing w:line="360" w:lineRule="auto"/>
-        <w:jc w:val="center"/>
-        <w:rPr>
-          <w:rFonts w:ascii="Times New Roman" w:hAnsi="Times New Roman" w:cs="Times New Roman"/>
-          <w:b/>
-          <w:bCs/>
-          <w:sz w:val="24"/>
-          <w:szCs w:val="24"/>
-        </w:rPr>
-      </w:pPr>
-    </w:p>
-    <w:p>
-      <w:pPr>
-        <w:spacing w:line="360" w:lineRule="auto"/>
-        <w:jc w:val="center"/>
-        <w:rPr>
-          <w:rFonts w:ascii="Times New Roman" w:hAnsi="Times New Roman" w:cs="Times New Roman"/>
-          <w:b/>
-          <w:bCs/>
-          <w:sz w:val="24"/>
-          <w:szCs w:val="24"/>
-        </w:rPr>
-      </w:pPr>
-    </w:p>
-    <w:p>
-      <w:pPr>
-        <w:spacing w:line="360" w:lineRule="auto"/>
-        <w:jc w:val="center"/>
-        <w:rPr>
-          <w:rFonts w:ascii="Times New Roman" w:hAnsi="Times New Roman" w:cs="Times New Roman"/>
-          <w:b/>
-          <w:bCs/>
-          <w:sz w:val="24"/>
-          <w:szCs w:val="24"/>
-        </w:rPr>
-      </w:pPr>
-    </w:p>
-    <w:p>
-      <w:pPr>
-        <w:spacing w:line="360" w:lineRule="auto"/>
-        <w:jc w:val="center"/>
-        <w:rPr>
-          <w:rFonts w:ascii="Times New Roman" w:hAnsi="Times New Roman" w:cs="Times New Roman"/>
-          <w:b/>
-          <w:bCs/>
-          <w:sz w:val="24"/>
-          <w:szCs w:val="24"/>
-        </w:rPr>
-      </w:pPr>
     </w:p>
     <w:p>
       <w:pPr>
@@ -7630,9 +7989,7 @@
       <w:pPr>
         <w:spacing w:line="360" w:lineRule="auto"/>
         <w:rPr>
-          <w:rFonts w:ascii="Times New Roman" w:hAnsi="Times New Roman" w:cs="Times New Roman"/>
-          <w:sz w:val="24"/>
-          <w:szCs w:val="24"/>
+          <w:noProof/>
         </w:rPr>
       </w:pPr>
       <w:r>
@@ -7643,6 +8000,328 @@
         </w:rPr>
         <w:fldChar w:fldCharType="end"/>
       </w:r>
+      <w:r>
+        <w:rPr>
+          <w:rFonts w:ascii="Times New Roman" w:hAnsi="Times New Roman" w:cs="Times New Roman"/>
+          <w:sz w:val="24"/>
+          <w:szCs w:val="24"/>
+        </w:rPr>
+        <w:fldChar w:fldCharType="begin"/>
+      </w:r>
+      <w:r>
+        <w:rPr>
+          <w:rFonts w:ascii="Times New Roman" w:hAnsi="Times New Roman" w:cs="Times New Roman"/>
+          <w:sz w:val="24"/>
+          <w:szCs w:val="24"/>
+        </w:rPr>
+        <w:instrText xml:space="preserve"> TOC \h \z \c "Fig 8." </w:instrText>
+      </w:r>
+      <w:r>
+        <w:rPr>
+          <w:rFonts w:ascii="Times New Roman" w:hAnsi="Times New Roman" w:cs="Times New Roman"/>
+          <w:sz w:val="24"/>
+          <w:szCs w:val="24"/>
+        </w:rPr>
+        <w:fldChar w:fldCharType="separate"/>
+      </w:r>
+    </w:p>
+    <w:p>
+      <w:pPr>
+        <w:pStyle w:val="TableofFigures"/>
+        <w:tabs>
+          <w:tab w:val="right" w:leader="dot" w:pos="9350"/>
+        </w:tabs>
+        <w:rPr>
+          <w:rFonts w:asciiTheme="minorHAnsi" w:eastAsiaTheme="minorEastAsia" w:hAnsiTheme="minorHAnsi"/>
+          <w:noProof/>
+          <w:sz w:val="22"/>
+        </w:rPr>
+      </w:pPr>
+      <w:hyperlink w:anchor="_Toc233464082" w:history="1">
+        <w:r>
+          <w:rPr>
+            <w:rStyle w:val="Hyperlink"/>
+            <w:noProof/>
+          </w:rPr>
+          <w:t>Fig 8. 1 Sentiment Analysis: Positive review</w:t>
+        </w:r>
+        <w:r>
+          <w:rPr>
+            <w:noProof/>
+            <w:webHidden/>
+          </w:rPr>
+          <w:tab/>
+        </w:r>
+        <w:r>
+          <w:rPr>
+            <w:noProof/>
+            <w:webHidden/>
+          </w:rPr>
+          <w:fldChar w:fldCharType="begin"/>
+        </w:r>
+        <w:r>
+          <w:rPr>
+            <w:noProof/>
+            <w:webHidden/>
+          </w:rPr>
+          <w:instrText xml:space="preserve"> PAGEREF _Toc233464082 \h </w:instrText>
+        </w:r>
+        <w:r>
+          <w:rPr>
+            <w:noProof/>
+            <w:webHidden/>
+          </w:rPr>
+        </w:r>
+        <w:r>
+          <w:rPr>
+            <w:noProof/>
+            <w:webHidden/>
+          </w:rPr>
+          <w:fldChar w:fldCharType="separate"/>
+        </w:r>
+        <w:r>
+          <w:rPr>
+            <w:noProof/>
+            <w:webHidden/>
+          </w:rPr>
+          <w:t>25</w:t>
+        </w:r>
+        <w:r>
+          <w:rPr>
+            <w:noProof/>
+            <w:webHidden/>
+          </w:rPr>
+          <w:fldChar w:fldCharType="end"/>
+        </w:r>
+      </w:hyperlink>
+    </w:p>
+    <w:p>
+      <w:pPr>
+        <w:pStyle w:val="TableofFigures"/>
+        <w:tabs>
+          <w:tab w:val="right" w:leader="dot" w:pos="9350"/>
+        </w:tabs>
+        <w:rPr>
+          <w:rFonts w:asciiTheme="minorHAnsi" w:eastAsiaTheme="minorEastAsia" w:hAnsiTheme="minorHAnsi"/>
+          <w:noProof/>
+          <w:sz w:val="22"/>
+        </w:rPr>
+      </w:pPr>
+      <w:hyperlink w:anchor="_Toc233464083" w:history="1">
+        <w:r>
+          <w:rPr>
+            <w:rStyle w:val="Hyperlink"/>
+            <w:noProof/>
+          </w:rPr>
+          <w:t>Fig 8. 2 Sentiment Analysis: Negative review</w:t>
+        </w:r>
+        <w:r>
+          <w:rPr>
+            <w:noProof/>
+            <w:webHidden/>
+          </w:rPr>
+          <w:tab/>
+        </w:r>
+        <w:r>
+          <w:rPr>
+            <w:noProof/>
+            <w:webHidden/>
+          </w:rPr>
+          <w:fldChar w:fldCharType="begin"/>
+        </w:r>
+        <w:r>
+          <w:rPr>
+            <w:noProof/>
+            <w:webHidden/>
+          </w:rPr>
+          <w:instrText xml:space="preserve"> PAGEREF _Toc233464083 \h </w:instrText>
+        </w:r>
+        <w:r>
+          <w:rPr>
+            <w:noProof/>
+            <w:webHidden/>
+          </w:rPr>
+        </w:r>
+        <w:r>
+          <w:rPr>
+            <w:noProof/>
+            <w:webHidden/>
+          </w:rPr>
+          <w:fldChar w:fldCharType="separate"/>
+        </w:r>
+        <w:r>
+          <w:rPr>
+            <w:noProof/>
+            <w:webHidden/>
+          </w:rPr>
+          <w:t>25</w:t>
+        </w:r>
+        <w:r>
+          <w:rPr>
+            <w:noProof/>
+            <w:webHidden/>
+          </w:rPr>
+          <w:fldChar w:fldCharType="end"/>
+        </w:r>
+      </w:hyperlink>
+    </w:p>
+    <w:p>
+      <w:pPr>
+        <w:pStyle w:val="TableofFigures"/>
+        <w:tabs>
+          <w:tab w:val="right" w:leader="dot" w:pos="9350"/>
+        </w:tabs>
+        <w:rPr>
+          <w:rFonts w:asciiTheme="minorHAnsi" w:eastAsiaTheme="minorEastAsia" w:hAnsiTheme="minorHAnsi"/>
+          <w:noProof/>
+          <w:sz w:val="22"/>
+        </w:rPr>
+      </w:pPr>
+      <w:hyperlink w:anchor="_Toc233464084" w:history="1">
+        <w:r>
+          <w:rPr>
+            <w:rStyle w:val="Hyperlink"/>
+            <w:noProof/>
+          </w:rPr>
+          <w:t>Fig 8. 3 Sentiment Analysis: Neutral review</w:t>
+        </w:r>
+        <w:r>
+          <w:rPr>
+            <w:noProof/>
+            <w:webHidden/>
+          </w:rPr>
+          <w:tab/>
+        </w:r>
+        <w:r>
+          <w:rPr>
+            <w:noProof/>
+            <w:webHidden/>
+          </w:rPr>
+          <w:fldChar w:fldCharType="begin"/>
+        </w:r>
+        <w:r>
+          <w:rPr>
+            <w:noProof/>
+            <w:webHidden/>
+          </w:rPr>
+          <w:instrText xml:space="preserve"> PAGEREF _Toc233464084 \h </w:instrText>
+        </w:r>
+        <w:r>
+          <w:rPr>
+            <w:noProof/>
+            <w:webHidden/>
+          </w:rPr>
+        </w:r>
+        <w:r>
+          <w:rPr>
+            <w:noProof/>
+            <w:webHidden/>
+          </w:rPr>
+          <w:fldChar w:fldCharType="separate"/>
+        </w:r>
+        <w:r>
+          <w:rPr>
+            <w:noProof/>
+            <w:webHidden/>
+          </w:rPr>
+          <w:t>25</w:t>
+        </w:r>
+        <w:r>
+          <w:rPr>
+            <w:noProof/>
+            <w:webHidden/>
+          </w:rPr>
+          <w:fldChar w:fldCharType="end"/>
+        </w:r>
+      </w:hyperlink>
+    </w:p>
+    <w:p>
+      <w:pPr>
+        <w:pStyle w:val="TableofFigures"/>
+        <w:tabs>
+          <w:tab w:val="right" w:leader="dot" w:pos="9350"/>
+        </w:tabs>
+        <w:rPr>
+          <w:rFonts w:asciiTheme="minorHAnsi" w:eastAsiaTheme="minorEastAsia" w:hAnsiTheme="minorHAnsi"/>
+          <w:noProof/>
+          <w:sz w:val="22"/>
+        </w:rPr>
+      </w:pPr>
+      <w:hyperlink w:anchor="_Toc233464085" w:history="1">
+        <w:r>
+          <w:rPr>
+            <w:rStyle w:val="Hyperlink"/>
+            <w:noProof/>
+          </w:rPr>
+          <w:t>Fig 8. 4 Text generation using transformers</w:t>
+        </w:r>
+        <w:r>
+          <w:rPr>
+            <w:noProof/>
+            <w:webHidden/>
+          </w:rPr>
+          <w:tab/>
+        </w:r>
+        <w:r>
+          <w:rPr>
+            <w:noProof/>
+            <w:webHidden/>
+          </w:rPr>
+          <w:fldChar w:fldCharType="begin"/>
+        </w:r>
+        <w:r>
+          <w:rPr>
+            <w:noProof/>
+            <w:webHidden/>
+          </w:rPr>
+          <w:instrText xml:space="preserve"> PAGEREF _Toc233464085 \h </w:instrText>
+        </w:r>
+        <w:r>
+          <w:rPr>
+            <w:noProof/>
+            <w:webHidden/>
+          </w:rPr>
+        </w:r>
+        <w:r>
+          <w:rPr>
+            <w:noProof/>
+            <w:webHidden/>
+          </w:rPr>
+          <w:fldChar w:fldCharType="separate"/>
+        </w:r>
+        <w:r>
+          <w:rPr>
+            <w:noProof/>
+            <w:webHidden/>
+          </w:rPr>
+          <w:t>26</w:t>
+        </w:r>
+        <w:r>
+          <w:rPr>
+            <w:noProof/>
+            <w:webHidden/>
+          </w:rPr>
+          <w:fldChar w:fldCharType="end"/>
+        </w:r>
+      </w:hyperlink>
+    </w:p>
+    <w:p>
+      <w:pPr>
+        <w:spacing w:line="360" w:lineRule="auto"/>
+        <w:rPr>
+          <w:rFonts w:ascii="Times New Roman" w:hAnsi="Times New Roman" w:cs="Times New Roman"/>
+          <w:sz w:val="24"/>
+          <w:szCs w:val="24"/>
+        </w:rPr>
+      </w:pPr>
+      <w:r>
+        <w:rPr>
+          <w:rFonts w:ascii="Times New Roman" w:hAnsi="Times New Roman" w:cs="Times New Roman"/>
+          <w:sz w:val="24"/>
+          <w:szCs w:val="24"/>
+        </w:rPr>
+        <w:fldChar w:fldCharType="end"/>
+      </w:r>
     </w:p>
     <w:p>
       <w:pPr>
@@ -7683,54 +8362,6 @@
         </w:rPr>
         <w:tab/>
       </w:r>
-    </w:p>
-    <w:p>
-      <w:pPr>
-        <w:tabs>
-          <w:tab w:val="left" w:pos="1920"/>
-        </w:tabs>
-        <w:rPr>
-          <w:rFonts w:ascii="Times New Roman" w:hAnsi="Times New Roman" w:cs="Times New Roman"/>
-          <w:sz w:val="24"/>
-          <w:szCs w:val="24"/>
-        </w:rPr>
-      </w:pPr>
-    </w:p>
-    <w:p>
-      <w:pPr>
-        <w:tabs>
-          <w:tab w:val="left" w:pos="1920"/>
-        </w:tabs>
-        <w:rPr>
-          <w:rFonts w:ascii="Times New Roman" w:hAnsi="Times New Roman" w:cs="Times New Roman"/>
-          <w:sz w:val="24"/>
-          <w:szCs w:val="24"/>
-        </w:rPr>
-      </w:pPr>
-    </w:p>
-    <w:p>
-      <w:pPr>
-        <w:tabs>
-          <w:tab w:val="left" w:pos="1920"/>
-        </w:tabs>
-        <w:rPr>
-          <w:rFonts w:ascii="Times New Roman" w:hAnsi="Times New Roman" w:cs="Times New Roman"/>
-          <w:sz w:val="24"/>
-          <w:szCs w:val="24"/>
-        </w:rPr>
-      </w:pPr>
-    </w:p>
-    <w:p>
-      <w:pPr>
-        <w:tabs>
-          <w:tab w:val="left" w:pos="1920"/>
-        </w:tabs>
-        <w:rPr>
-          <w:rFonts w:ascii="Times New Roman" w:hAnsi="Times New Roman" w:cs="Times New Roman"/>
-          <w:sz w:val="24"/>
-          <w:szCs w:val="24"/>
-        </w:rPr>
-      </w:pPr>
     </w:p>
     <w:p>
       <w:pPr>
@@ -8258,7 +8889,7 @@
         <w:pStyle w:val="Heading1"/>
         <w:spacing w:line="360" w:lineRule="auto"/>
       </w:pPr>
-      <w:bookmarkStart w:id="0" w:name="_Toc233376578"/>
+      <w:bookmarkStart w:id="0" w:name="_Toc233464129"/>
       <w:r>
         <w:lastRenderedPageBreak/>
         <w:t>WEEK 1: INTRODUCTION TO NLP</w:t>
@@ -8272,7 +8903,7 @@
       <w:pPr>
         <w:pStyle w:val="Heading2"/>
       </w:pPr>
-      <w:bookmarkStart w:id="1" w:name="_Toc233376579"/>
+      <w:bookmarkStart w:id="1" w:name="_Toc233464130"/>
       <w:r>
         <w:t xml:space="preserve">1.1 </w:t>
       </w:r>
@@ -8404,7 +9035,7 @@
       <w:pPr>
         <w:pStyle w:val="Heading2"/>
       </w:pPr>
-      <w:bookmarkStart w:id="3" w:name="_Toc233376580"/>
+      <w:bookmarkStart w:id="3" w:name="_Toc233464131"/>
       <w:r>
         <w:t xml:space="preserve">1.2 </w:t>
       </w:r>
@@ -8543,7 +9174,7 @@
       <w:pPr>
         <w:pStyle w:val="Heading2"/>
       </w:pPr>
-      <w:bookmarkStart w:id="5" w:name="_Toc233376581"/>
+      <w:bookmarkStart w:id="5" w:name="_Toc233464132"/>
       <w:r>
         <w:lastRenderedPageBreak/>
         <w:t xml:space="preserve">1.3 </w:t>
@@ -8665,7 +9296,7 @@
           <w:noProof/>
         </w:rPr>
       </w:pPr>
-      <w:bookmarkStart w:id="7" w:name="_Toc233376582"/>
+      <w:bookmarkStart w:id="7" w:name="_Toc233464133"/>
       <w:r>
         <w:rPr>
           <w:noProof/>
@@ -8805,7 +9436,7 @@
           <w:noProof/>
         </w:rPr>
       </w:pPr>
-      <w:bookmarkStart w:id="9" w:name="_Toc233376583"/>
+      <w:bookmarkStart w:id="9" w:name="_Toc233464134"/>
       <w:r>
         <w:rPr>
           <w:noProof/>
@@ -8953,7 +9584,7 @@
       <w:pPr>
         <w:pStyle w:val="Heading2"/>
       </w:pPr>
-      <w:bookmarkStart w:id="11" w:name="_Toc233376584"/>
+      <w:bookmarkStart w:id="11" w:name="_Toc233464135"/>
       <w:r>
         <w:lastRenderedPageBreak/>
         <w:t xml:space="preserve">1.6 </w:t>
@@ -9270,7 +9901,7 @@
         <w:pStyle w:val="Heading1"/>
         <w:spacing w:line="360" w:lineRule="auto"/>
       </w:pPr>
-      <w:bookmarkStart w:id="13" w:name="_Toc233376585"/>
+      <w:bookmarkStart w:id="13" w:name="_Toc233464136"/>
       <w:r>
         <w:lastRenderedPageBreak/>
         <w:t xml:space="preserve">WEEK 2: </w:t>
@@ -9284,7 +9915,7 @@
       <w:pPr>
         <w:pStyle w:val="Heading2"/>
       </w:pPr>
-      <w:bookmarkStart w:id="14" w:name="_Toc233376586"/>
+      <w:bookmarkStart w:id="14" w:name="_Toc233464137"/>
       <w:r>
         <w:t xml:space="preserve">2.1 </w:t>
       </w:r>
@@ -9301,7 +9932,7 @@
         <w:pStyle w:val="Heading3"/>
         <w:spacing w:line="360" w:lineRule="auto"/>
       </w:pPr>
-      <w:bookmarkStart w:id="15" w:name="_Toc233376587"/>
+      <w:bookmarkStart w:id="15" w:name="_Toc233464138"/>
       <w:r>
         <w:t xml:space="preserve">2.1.1 </w:t>
       </w:r>
@@ -9425,7 +10056,7 @@
         <w:pStyle w:val="Heading3"/>
         <w:spacing w:line="360" w:lineRule="auto"/>
       </w:pPr>
-      <w:bookmarkStart w:id="17" w:name="_Toc233376588"/>
+      <w:bookmarkStart w:id="17" w:name="_Toc233464139"/>
       <w:r>
         <w:t xml:space="preserve">2.1.2 </w:t>
       </w:r>
@@ -9562,7 +10193,7 @@
         <w:pStyle w:val="Heading3"/>
         <w:spacing w:line="360" w:lineRule="auto"/>
       </w:pPr>
-      <w:bookmarkStart w:id="19" w:name="_Toc233376589"/>
+      <w:bookmarkStart w:id="19" w:name="_Toc233464140"/>
       <w:r>
         <w:lastRenderedPageBreak/>
         <w:t xml:space="preserve">2.1.3 </w:t>
@@ -9710,7 +10341,7 @@
       <w:pPr>
         <w:pStyle w:val="Heading2"/>
       </w:pPr>
-      <w:bookmarkStart w:id="21" w:name="_Toc233376590"/>
+      <w:bookmarkStart w:id="21" w:name="_Toc233464141"/>
       <w:r>
         <w:t xml:space="preserve">2.2 </w:t>
       </w:r>
@@ -9837,7 +10468,7 @@
       <w:pPr>
         <w:pStyle w:val="Heading2"/>
       </w:pPr>
-      <w:bookmarkStart w:id="23" w:name="_Toc233376591"/>
+      <w:bookmarkStart w:id="23" w:name="_Toc233464142"/>
       <w:r>
         <w:lastRenderedPageBreak/>
         <w:t xml:space="preserve">2.3 </w:t>
@@ -9963,7 +10594,7 @@
       <w:pPr>
         <w:pStyle w:val="Heading2"/>
       </w:pPr>
-      <w:bookmarkStart w:id="25" w:name="_Toc233376592"/>
+      <w:bookmarkStart w:id="25" w:name="_Toc233464143"/>
       <w:r>
         <w:t xml:space="preserve">2.4 </w:t>
       </w:r>
@@ -10082,7 +10713,7 @@
       <w:pPr>
         <w:pStyle w:val="Heading2"/>
       </w:pPr>
-      <w:bookmarkStart w:id="27" w:name="_Toc233376593"/>
+      <w:bookmarkStart w:id="27" w:name="_Toc233464144"/>
       <w:r>
         <w:lastRenderedPageBreak/>
         <w:t xml:space="preserve">2.5 </w:t>
@@ -10383,7 +11014,7 @@
         <w:pStyle w:val="Heading1"/>
         <w:spacing w:line="360" w:lineRule="auto"/>
       </w:pPr>
-      <w:bookmarkStart w:id="29" w:name="_Toc233376594"/>
+      <w:bookmarkStart w:id="29" w:name="_Toc233464145"/>
       <w:r>
         <w:lastRenderedPageBreak/>
         <w:t>WEEK 3: SEQUENCE PREDICTION AND HIDDEN STATE ANALYSIS</w:t>
@@ -10394,7 +11025,7 @@
       <w:pPr>
         <w:pStyle w:val="Heading2"/>
       </w:pPr>
-      <w:bookmarkStart w:id="30" w:name="_Toc233376595"/>
+      <w:bookmarkStart w:id="30" w:name="_Toc233464146"/>
       <w:r>
         <w:t xml:space="preserve">3.1 </w:t>
       </w:r>
@@ -10531,7 +11162,7 @@
       <w:pPr>
         <w:pStyle w:val="Heading2"/>
       </w:pPr>
-      <w:bookmarkStart w:id="32" w:name="_Toc233376596"/>
+      <w:bookmarkStart w:id="32" w:name="_Toc233464147"/>
       <w:r>
         <w:t xml:space="preserve">3.2 </w:t>
       </w:r>
@@ -10658,7 +11289,7 @@
       <w:pPr>
         <w:pStyle w:val="Heading2"/>
       </w:pPr>
-      <w:bookmarkStart w:id="34" w:name="_Toc233376597"/>
+      <w:bookmarkStart w:id="34" w:name="_Toc233464148"/>
       <w:r>
         <w:lastRenderedPageBreak/>
         <w:t xml:space="preserve">3.3 </w:t>
@@ -10820,7 +11451,7 @@
       <w:pPr>
         <w:pStyle w:val="Heading2"/>
       </w:pPr>
-      <w:bookmarkStart w:id="36" w:name="_Toc233376598"/>
+      <w:bookmarkStart w:id="36" w:name="_Toc233464149"/>
       <w:r>
         <w:t xml:space="preserve">3. 4 </w:t>
       </w:r>
@@ -10959,7 +11590,7 @@
       <w:pPr>
         <w:pStyle w:val="Heading2"/>
       </w:pPr>
-      <w:bookmarkStart w:id="38" w:name="_Toc233376599"/>
+      <w:bookmarkStart w:id="38" w:name="_Toc233464150"/>
       <w:r>
         <w:lastRenderedPageBreak/>
         <w:t xml:space="preserve">3.5 </w:t>
@@ -11279,7 +11910,7 @@
         <w:pStyle w:val="Heading1"/>
         <w:spacing w:line="360" w:lineRule="auto"/>
       </w:pPr>
-      <w:bookmarkStart w:id="40" w:name="_Toc233376600"/>
+      <w:bookmarkStart w:id="40" w:name="_Toc233464151"/>
       <w:r>
         <w:lastRenderedPageBreak/>
         <w:t>WEEK 4: SYNTACTIC AND SEMANTIC ANALYSIS</w:t>
@@ -11291,7 +11922,7 @@
         <w:pStyle w:val="Heading2"/>
         <w:spacing w:line="360" w:lineRule="auto"/>
       </w:pPr>
-      <w:bookmarkStart w:id="41" w:name="_Toc233376601"/>
+      <w:bookmarkStart w:id="41" w:name="_Toc233464152"/>
       <w:r>
         <w:t xml:space="preserve">4.1 </w:t>
       </w:r>
@@ -11305,7 +11936,7 @@
         <w:pStyle w:val="Heading3"/>
         <w:spacing w:line="360" w:lineRule="auto"/>
       </w:pPr>
-      <w:bookmarkStart w:id="42" w:name="_Toc233376602"/>
+      <w:bookmarkStart w:id="42" w:name="_Toc233464153"/>
       <w:r>
         <w:t>4.1</w:t>
       </w:r>
@@ -11475,7 +12106,7 @@
         <w:pStyle w:val="Heading3"/>
         <w:spacing w:line="360" w:lineRule="auto"/>
       </w:pPr>
-      <w:bookmarkStart w:id="44" w:name="_Toc233376603"/>
+      <w:bookmarkStart w:id="44" w:name="_Toc233464154"/>
       <w:r>
         <w:t>4.</w:t>
       </w:r>
@@ -11611,7 +12242,7 @@
         <w:pStyle w:val="Heading2"/>
         <w:spacing w:line="360" w:lineRule="auto"/>
       </w:pPr>
-      <w:bookmarkStart w:id="46" w:name="_Toc233376604"/>
+      <w:bookmarkStart w:id="46" w:name="_Toc233464155"/>
       <w:r>
         <w:lastRenderedPageBreak/>
         <w:t xml:space="preserve">4.2 </w:t>
@@ -11629,7 +12260,7 @@
         <w:pStyle w:val="Heading3"/>
         <w:spacing w:line="360" w:lineRule="auto"/>
       </w:pPr>
-      <w:bookmarkStart w:id="47" w:name="_Toc233376605"/>
+      <w:bookmarkStart w:id="47" w:name="_Toc233464156"/>
       <w:r>
         <w:t>4.</w:t>
       </w:r>
@@ -11933,7 +12564,7 @@
         <w:pStyle w:val="Heading3"/>
         <w:spacing w:line="360" w:lineRule="auto"/>
       </w:pPr>
-      <w:bookmarkStart w:id="50" w:name="_Toc233376606"/>
+      <w:bookmarkStart w:id="50" w:name="_Toc233464157"/>
       <w:r>
         <w:lastRenderedPageBreak/>
         <w:t>4.</w:t>
@@ -11951,7 +12582,7 @@
         <w:pStyle w:val="Heading4"/>
         <w:spacing w:line="360" w:lineRule="auto"/>
       </w:pPr>
-      <w:bookmarkStart w:id="51" w:name="_Toc233376607"/>
+      <w:bookmarkStart w:id="51" w:name="_Toc233464158"/>
       <w:r>
         <w:t>4.</w:t>
       </w:r>
@@ -12246,7 +12877,7 @@
         <w:pStyle w:val="Heading4"/>
         <w:spacing w:line="360" w:lineRule="auto"/>
       </w:pPr>
-      <w:bookmarkStart w:id="54" w:name="_Toc233376608"/>
+      <w:bookmarkStart w:id="54" w:name="_Toc233464159"/>
       <w:r>
         <w:t>4.</w:t>
       </w:r>
@@ -12831,7 +13462,7 @@
         <w:pStyle w:val="Heading1"/>
         <w:spacing w:line="360" w:lineRule="auto"/>
       </w:pPr>
-      <w:bookmarkStart w:id="57" w:name="_Toc233376609"/>
+      <w:bookmarkStart w:id="57" w:name="_Toc233464160"/>
       <w:r>
         <w:lastRenderedPageBreak/>
         <w:t>WEEK 5: MINI-NLP PROJECT</w:t>
@@ -12846,7 +13477,7 @@
         <w:pStyle w:val="Heading2"/>
         <w:spacing w:line="360" w:lineRule="auto"/>
       </w:pPr>
-      <w:bookmarkStart w:id="58" w:name="_Toc233376610"/>
+      <w:bookmarkStart w:id="58" w:name="_Toc233464161"/>
       <w:r>
         <w:t xml:space="preserve">5.1 </w:t>
       </w:r>
@@ -12866,7 +13497,7 @@
         <w:pStyle w:val="Heading3"/>
         <w:spacing w:line="360" w:lineRule="auto"/>
       </w:pPr>
-      <w:bookmarkStart w:id="59" w:name="_Toc233376611"/>
+      <w:bookmarkStart w:id="59" w:name="_Toc233464162"/>
       <w:r>
         <w:t>5.1</w:t>
       </w:r>
@@ -13002,7 +13633,7 @@
         <w:pStyle w:val="Heading3"/>
         <w:spacing w:line="360" w:lineRule="auto"/>
       </w:pPr>
-      <w:bookmarkStart w:id="61" w:name="_Toc233376612"/>
+      <w:bookmarkStart w:id="61" w:name="_Toc233464163"/>
       <w:r>
         <w:t>5.</w:t>
       </w:r>
@@ -13147,7 +13778,7 @@
         <w:pStyle w:val="Heading2"/>
         <w:spacing w:line="360" w:lineRule="auto"/>
       </w:pPr>
-      <w:bookmarkStart w:id="63" w:name="_Toc233376613"/>
+      <w:bookmarkStart w:id="63" w:name="_Toc233464164"/>
       <w:r>
         <w:t xml:space="preserve">5.2 </w:t>
       </w:r>
@@ -13392,7 +14023,7 @@
         <w:pStyle w:val="Heading1"/>
         <w:spacing w:line="360" w:lineRule="auto"/>
       </w:pPr>
-      <w:bookmarkStart w:id="65" w:name="_Toc233376614"/>
+      <w:bookmarkStart w:id="65" w:name="_Toc233464165"/>
       <w:r>
         <w:lastRenderedPageBreak/>
         <w:t>WEEK 6: WORD EMBEDDINGS AND DISTRIBUTED REPRESENTATIONS</w:t>
@@ -13404,7 +14035,7 @@
         <w:pStyle w:val="Heading2"/>
         <w:spacing w:line="360" w:lineRule="auto"/>
       </w:pPr>
-      <w:bookmarkStart w:id="66" w:name="_Toc233376615"/>
+      <w:bookmarkStart w:id="66" w:name="_Toc233464166"/>
       <w:r>
         <w:t>6.1 Training a Word2Vec Model</w:t>
       </w:r>
@@ -13532,7 +14163,7 @@
         <w:pStyle w:val="Heading2"/>
         <w:spacing w:line="360" w:lineRule="auto"/>
       </w:pPr>
-      <w:bookmarkStart w:id="68" w:name="_Toc233376616"/>
+      <w:bookmarkStart w:id="68" w:name="_Toc233464167"/>
       <w:r>
         <w:t>6.2 Word Similarity Analysis</w:t>
       </w:r>
@@ -13609,10 +14240,7 @@
         <w:fldChar w:fldCharType="begin"/>
       </w:r>
       <w:r>
-        <w:instrText xml:space="preserve"> SEQ Fig_6. \* ARABI</w:instrText>
-      </w:r>
-      <w:r>
-        <w:instrText xml:space="preserve">C </w:instrText>
+        <w:instrText xml:space="preserve"> SEQ Fig_6. \* ARABIC </w:instrText>
       </w:r>
       <w:r>
         <w:fldChar w:fldCharType="separate"/>
@@ -13665,7 +14293,7 @@
         <w:pStyle w:val="Heading2"/>
         <w:spacing w:line="360" w:lineRule="auto"/>
       </w:pPr>
-      <w:bookmarkStart w:id="70" w:name="_Toc233376617"/>
+      <w:bookmarkStart w:id="70" w:name="_Toc233464168"/>
       <w:r>
         <w:lastRenderedPageBreak/>
         <w:t>6.3 One-Hot Encoding vs. Word Embeddings</w:t>
@@ -13677,7 +14305,7 @@
         <w:pStyle w:val="Heading3"/>
         <w:spacing w:line="360" w:lineRule="auto"/>
       </w:pPr>
-      <w:bookmarkStart w:id="71" w:name="_Toc233376618"/>
+      <w:bookmarkStart w:id="71" w:name="_Toc233464169"/>
       <w:r>
         <w:t>6.3.1 One-Hot Encoding</w:t>
       </w:r>
@@ -13805,7 +14433,7 @@
         <w:pStyle w:val="Heading3"/>
         <w:spacing w:line="360" w:lineRule="auto"/>
       </w:pPr>
-      <w:bookmarkStart w:id="73" w:name="_Toc233376619"/>
+      <w:bookmarkStart w:id="73" w:name="_Toc233464170"/>
       <w:r>
         <w:t>6.3.2 Word Embedding</w:t>
       </w:r>
@@ -13888,7 +14516,10 @@
         <w:fldChar w:fldCharType="begin"/>
       </w:r>
       <w:r>
-        <w:instrText xml:space="preserve"> SEQ Fig_6. \* ARABIC </w:instrText>
+        <w:instrText xml:space="preserve"> SEQ Fig</w:instrText>
+      </w:r>
+      <w:r>
+        <w:instrText xml:space="preserve">_6. \* ARABIC </w:instrText>
       </w:r>
       <w:r>
         <w:fldChar w:fldCharType="separate"/>
@@ -13933,7 +14564,7 @@
         <w:pStyle w:val="Heading3"/>
         <w:spacing w:line="360" w:lineRule="auto"/>
       </w:pPr>
-      <w:bookmarkStart w:id="75" w:name="_Toc233376620"/>
+      <w:bookmarkStart w:id="75" w:name="_Toc233464171"/>
       <w:r>
         <w:t>6.3.3 Differences Between One-Hot Encoding and Word Embedding</w:t>
       </w:r>
@@ -14390,7 +15021,7 @@
         <w:pStyle w:val="Heading2"/>
         <w:spacing w:line="360" w:lineRule="auto"/>
       </w:pPr>
-      <w:bookmarkStart w:id="77" w:name="_Toc233376621"/>
+      <w:bookmarkStart w:id="77" w:name="_Toc233464172"/>
       <w:r>
         <w:t>6.</w:t>
       </w:r>
@@ -14407,7 +15038,7 @@
         <w:pStyle w:val="Heading3"/>
         <w:spacing w:line="360" w:lineRule="auto"/>
       </w:pPr>
-      <w:bookmarkStart w:id="78" w:name="_Toc233376622"/>
+      <w:bookmarkStart w:id="78" w:name="_Toc233464173"/>
       <w:r>
         <w:t>6.4.1 NLP Pipeline</w:t>
       </w:r>
@@ -14535,7 +15166,7 @@
         <w:pStyle w:val="Heading3"/>
         <w:spacing w:line="360" w:lineRule="auto"/>
       </w:pPr>
-      <w:bookmarkStart w:id="80" w:name="_Toc233376623"/>
+      <w:bookmarkStart w:id="80" w:name="_Toc233464174"/>
       <w:r>
         <w:t>6.4.2 Model Training</w:t>
       </w:r>
@@ -14619,7 +15250,10 @@
         <w:fldChar w:fldCharType="begin"/>
       </w:r>
       <w:r>
-        <w:instrText xml:space="preserve"> SEQ Fig_6. \* ARABIC </w:instrText>
+        <w:instrText xml:space="preserve"> </w:instrText>
+      </w:r>
+      <w:r>
+        <w:instrText xml:space="preserve">SEQ Fig_6. \* ARABIC </w:instrText>
       </w:r>
       <w:r>
         <w:fldChar w:fldCharType="separate"/>
@@ -14664,7 +15298,7 @@
         <w:pStyle w:val="Heading3"/>
         <w:spacing w:line="360" w:lineRule="auto"/>
       </w:pPr>
-      <w:bookmarkStart w:id="82" w:name="_Toc233376624"/>
+      <w:bookmarkStart w:id="82" w:name="_Toc233464175"/>
       <w:r>
         <w:t>6.4.3 Model Test</w:t>
       </w:r>
@@ -14742,7 +15376,10 @@
         <w:fldChar w:fldCharType="begin"/>
       </w:r>
       <w:r>
-        <w:instrText xml:space="preserve"> SEQ Fig_6. \* ARABIC </w:instrText>
+        <w:instrText xml:space="preserve"> SEQ</w:instrText>
+      </w:r>
+      <w:r>
+        <w:instrText xml:space="preserve"> Fig_6. \* ARABIC </w:instrText>
       </w:r>
       <w:r>
         <w:fldChar w:fldCharType="separate"/>
@@ -14930,7 +15567,7 @@
         <w:pStyle w:val="Heading1"/>
         <w:spacing w:line="360" w:lineRule="auto"/>
       </w:pPr>
-      <w:bookmarkStart w:id="84" w:name="_Toc233376625"/>
+      <w:bookmarkStart w:id="84" w:name="_Toc233464176"/>
       <w:r>
         <w:lastRenderedPageBreak/>
         <w:t>WEEK 7: NEURAL LANGUAGE MODELS AND DEEP LEARNING FOR NLP</w:t>
@@ -14942,7 +15579,7 @@
         <w:pStyle w:val="Heading2"/>
         <w:spacing w:line="360" w:lineRule="auto"/>
       </w:pPr>
-      <w:bookmarkStart w:id="85" w:name="_Toc233376626"/>
+      <w:bookmarkStart w:id="85" w:name="_Toc233464177"/>
       <w:r>
         <w:t>7.1 Language Model Comparison</w:t>
       </w:r>
@@ -15377,7 +16014,7 @@
         <w:pStyle w:val="Heading2"/>
         <w:spacing w:line="360" w:lineRule="auto"/>
       </w:pPr>
-      <w:bookmarkStart w:id="87" w:name="_Toc233376627"/>
+      <w:bookmarkStart w:id="87" w:name="_Toc233464178"/>
       <w:r>
         <w:t>7.2 Neural Network Components</w:t>
       </w:r>
@@ -15515,7 +16152,7 @@
         <w:pStyle w:val="Heading2"/>
         <w:spacing w:line="360" w:lineRule="auto"/>
       </w:pPr>
-      <w:bookmarkStart w:id="89" w:name="_Toc233376628"/>
+      <w:bookmarkStart w:id="89" w:name="_Toc233464179"/>
       <w:r>
         <w:lastRenderedPageBreak/>
         <w:t>7.3 Text Prediction System</w:t>
@@ -15638,7 +16275,7 @@
         <w:pStyle w:val="Heading2"/>
         <w:spacing w:line="360" w:lineRule="auto"/>
       </w:pPr>
-      <w:bookmarkStart w:id="91" w:name="_Toc233376629"/>
+      <w:bookmarkStart w:id="91" w:name="_Toc233464180"/>
       <w:r>
         <w:t xml:space="preserve">7.4 </w:t>
       </w:r>
@@ -15652,7 +16289,7 @@
         <w:pStyle w:val="Heading3"/>
         <w:spacing w:line="360" w:lineRule="auto"/>
       </w:pPr>
-      <w:bookmarkStart w:id="92" w:name="_Toc233376630"/>
+      <w:bookmarkStart w:id="92" w:name="_Toc233464181"/>
       <w:r>
         <w:t>7.4.1 Training the model</w:t>
       </w:r>
@@ -15773,7 +16410,7 @@
         <w:pStyle w:val="Heading3"/>
         <w:spacing w:line="360" w:lineRule="auto"/>
       </w:pPr>
-      <w:bookmarkStart w:id="94" w:name="_Toc233376631"/>
+      <w:bookmarkStart w:id="94" w:name="_Toc233464182"/>
       <w:r>
         <w:t xml:space="preserve">7.4.2 </w:t>
       </w:r>
@@ -15923,6 +16560,750 @@
           <w:szCs w:val="24"/>
         </w:rPr>
         <w:t>.</w:t>
+      </w:r>
+    </w:p>
+    <w:p>
+      <w:pPr>
+        <w:rPr>
+          <w:rFonts w:ascii="Times New Roman" w:hAnsi="Times New Roman" w:cs="Times New Roman"/>
+          <w:sz w:val="24"/>
+          <w:szCs w:val="24"/>
+        </w:rPr>
+      </w:pPr>
+    </w:p>
+    <w:p>
+      <w:pPr>
+        <w:rPr>
+          <w:rFonts w:ascii="Times New Roman" w:hAnsi="Times New Roman" w:cs="Times New Roman"/>
+          <w:sz w:val="24"/>
+          <w:szCs w:val="24"/>
+        </w:rPr>
+      </w:pPr>
+    </w:p>
+    <w:p>
+      <w:pPr>
+        <w:rPr>
+          <w:rFonts w:ascii="Times New Roman" w:hAnsi="Times New Roman" w:cs="Times New Roman"/>
+          <w:sz w:val="24"/>
+          <w:szCs w:val="24"/>
+        </w:rPr>
+      </w:pPr>
+    </w:p>
+    <w:p>
+      <w:pPr>
+        <w:tabs>
+          <w:tab w:val="left" w:pos="5205"/>
+        </w:tabs>
+        <w:rPr>
+          <w:rFonts w:ascii="Times New Roman" w:hAnsi="Times New Roman" w:cs="Times New Roman"/>
+          <w:sz w:val="24"/>
+          <w:szCs w:val="24"/>
+        </w:rPr>
+      </w:pPr>
+      <w:r>
+        <w:rPr>
+          <w:rFonts w:ascii="Times New Roman" w:hAnsi="Times New Roman" w:cs="Times New Roman"/>
+          <w:sz w:val="24"/>
+          <w:szCs w:val="24"/>
+        </w:rPr>
+        <w:tab/>
+      </w:r>
+    </w:p>
+    <w:p>
+      <w:pPr>
+        <w:tabs>
+          <w:tab w:val="left" w:pos="5205"/>
+        </w:tabs>
+        <w:rPr>
+          <w:rFonts w:ascii="Times New Roman" w:hAnsi="Times New Roman" w:cs="Times New Roman"/>
+          <w:sz w:val="24"/>
+          <w:szCs w:val="24"/>
+        </w:rPr>
+      </w:pPr>
+    </w:p>
+    <w:p>
+      <w:pPr>
+        <w:tabs>
+          <w:tab w:val="left" w:pos="5205"/>
+        </w:tabs>
+        <w:rPr>
+          <w:rFonts w:ascii="Times New Roman" w:hAnsi="Times New Roman" w:cs="Times New Roman"/>
+          <w:sz w:val="24"/>
+          <w:szCs w:val="24"/>
+        </w:rPr>
+      </w:pPr>
+    </w:p>
+    <w:p>
+      <w:pPr>
+        <w:tabs>
+          <w:tab w:val="left" w:pos="5205"/>
+        </w:tabs>
+        <w:rPr>
+          <w:rFonts w:ascii="Times New Roman" w:hAnsi="Times New Roman" w:cs="Times New Roman"/>
+          <w:sz w:val="24"/>
+          <w:szCs w:val="24"/>
+        </w:rPr>
+      </w:pPr>
+    </w:p>
+    <w:p>
+      <w:pPr>
+        <w:tabs>
+          <w:tab w:val="left" w:pos="5205"/>
+        </w:tabs>
+        <w:rPr>
+          <w:rFonts w:ascii="Times New Roman" w:hAnsi="Times New Roman" w:cs="Times New Roman"/>
+          <w:sz w:val="24"/>
+          <w:szCs w:val="24"/>
+        </w:rPr>
+      </w:pPr>
+    </w:p>
+    <w:p>
+      <w:pPr>
+        <w:tabs>
+          <w:tab w:val="left" w:pos="5205"/>
+        </w:tabs>
+        <w:rPr>
+          <w:rFonts w:ascii="Times New Roman" w:hAnsi="Times New Roman" w:cs="Times New Roman"/>
+          <w:sz w:val="24"/>
+          <w:szCs w:val="24"/>
+        </w:rPr>
+      </w:pPr>
+    </w:p>
+    <w:p>
+      <w:pPr>
+        <w:tabs>
+          <w:tab w:val="left" w:pos="5205"/>
+        </w:tabs>
+        <w:rPr>
+          <w:rFonts w:ascii="Times New Roman" w:hAnsi="Times New Roman" w:cs="Times New Roman"/>
+          <w:sz w:val="24"/>
+          <w:szCs w:val="24"/>
+        </w:rPr>
+      </w:pPr>
+    </w:p>
+    <w:p>
+      <w:pPr>
+        <w:tabs>
+          <w:tab w:val="left" w:pos="5205"/>
+        </w:tabs>
+        <w:rPr>
+          <w:rFonts w:ascii="Times New Roman" w:hAnsi="Times New Roman" w:cs="Times New Roman"/>
+          <w:sz w:val="24"/>
+          <w:szCs w:val="24"/>
+        </w:rPr>
+      </w:pPr>
+    </w:p>
+    <w:p>
+      <w:pPr>
+        <w:tabs>
+          <w:tab w:val="left" w:pos="5205"/>
+        </w:tabs>
+        <w:rPr>
+          <w:rFonts w:ascii="Times New Roman" w:hAnsi="Times New Roman" w:cs="Times New Roman"/>
+          <w:sz w:val="24"/>
+          <w:szCs w:val="24"/>
+        </w:rPr>
+      </w:pPr>
+    </w:p>
+    <w:p>
+      <w:pPr>
+        <w:tabs>
+          <w:tab w:val="left" w:pos="5205"/>
+        </w:tabs>
+        <w:rPr>
+          <w:rFonts w:ascii="Times New Roman" w:hAnsi="Times New Roman" w:cs="Times New Roman"/>
+          <w:sz w:val="24"/>
+          <w:szCs w:val="24"/>
+        </w:rPr>
+      </w:pPr>
+    </w:p>
+    <w:p>
+      <w:pPr>
+        <w:tabs>
+          <w:tab w:val="left" w:pos="5205"/>
+        </w:tabs>
+        <w:rPr>
+          <w:rFonts w:ascii="Times New Roman" w:hAnsi="Times New Roman" w:cs="Times New Roman"/>
+          <w:sz w:val="24"/>
+          <w:szCs w:val="24"/>
+        </w:rPr>
+      </w:pPr>
+    </w:p>
+    <w:p>
+      <w:pPr>
+        <w:pStyle w:val="Heading1"/>
+        <w:spacing w:line="360" w:lineRule="auto"/>
+      </w:pPr>
+      <w:bookmarkStart w:id="96" w:name="_Toc233464183"/>
+      <w:r>
+        <w:lastRenderedPageBreak/>
+        <w:t>WEEK 8: TRANSFORMER MODELS AND ATTENTION MECHANISMS</w:t>
+      </w:r>
+      <w:bookmarkEnd w:id="96"/>
+    </w:p>
+    <w:p>
+      <w:pPr>
+        <w:pStyle w:val="Heading2"/>
+        <w:spacing w:line="360" w:lineRule="auto"/>
+      </w:pPr>
+      <w:bookmarkStart w:id="97" w:name="_Toc233464184"/>
+      <w:r>
+        <w:t>8.1 Sentiment Analysis</w:t>
+      </w:r>
+      <w:bookmarkEnd w:id="97"/>
+    </w:p>
+    <w:p>
+      <w:pPr>
+        <w:pStyle w:val="Heading3"/>
+        <w:spacing w:line="360" w:lineRule="auto"/>
+      </w:pPr>
+      <w:bookmarkStart w:id="98" w:name="_Toc233464185"/>
+      <w:r>
+        <w:t>8.1.1 Positive Review</w:t>
+      </w:r>
+      <w:bookmarkEnd w:id="98"/>
+    </w:p>
+    <w:p>
+      <w:pPr>
+        <w:tabs>
+          <w:tab w:val="left" w:pos="5205"/>
+        </w:tabs>
+        <w:spacing w:line="360" w:lineRule="auto"/>
+        <w:rPr>
+          <w:rFonts w:ascii="Times New Roman" w:hAnsi="Times New Roman" w:cs="Times New Roman"/>
+          <w:sz w:val="24"/>
+          <w:szCs w:val="24"/>
+        </w:rPr>
+      </w:pPr>
+      <w:r>
+        <w:rPr>
+          <w:rFonts w:ascii="Times New Roman" w:hAnsi="Times New Roman" w:cs="Times New Roman"/>
+          <w:noProof/>
+          <w:sz w:val="24"/>
+          <w:szCs w:val="24"/>
+        </w:rPr>
+        <w:drawing>
+          <wp:inline distT="0" distB="0" distL="0" distR="0" wp14:anchorId="4D59B116" wp14:editId="338494CE">
+            <wp:extent cx="5943600" cy="531495"/>
+            <wp:effectExtent l="0" t="0" r="0" b="1905"/>
+            <wp:docPr id="37" name="Picture 37"/>
+            <wp:cNvGraphicFramePr>
+              <a:graphicFrameLocks xmlns:a="http://schemas.openxmlformats.org/drawingml/2006/main" noChangeAspect="1"/>
+            </wp:cNvGraphicFramePr>
+            <a:graphic xmlns:a="http://schemas.openxmlformats.org/drawingml/2006/main">
+              <a:graphicData uri="http://schemas.openxmlformats.org/drawingml/2006/picture">
+                <pic:pic xmlns:pic="http://schemas.openxmlformats.org/drawingml/2006/picture">
+                  <pic:nvPicPr>
+                    <pic:cNvPr id="37" name="Picture 37"/>
+                    <pic:cNvPicPr/>
+                  </pic:nvPicPr>
+                  <pic:blipFill>
+                    <a:blip r:embed="rId52">
+                      <a:extLst>
+                        <a:ext uri="{28A0092B-C50C-407E-A947-70E740481C1C}">
+                          <a14:useLocalDpi xmlns:a14="http://schemas.microsoft.com/office/drawing/2010/main" val="0"/>
+                        </a:ext>
+                      </a:extLst>
+                    </a:blip>
+                    <a:stretch>
+                      <a:fillRect/>
+                    </a:stretch>
+                  </pic:blipFill>
+                  <pic:spPr>
+                    <a:xfrm>
+                      <a:off x="0" y="0"/>
+                      <a:ext cx="5943600" cy="531495"/>
+                    </a:xfrm>
+                    <a:prstGeom prst="rect">
+                      <a:avLst/>
+                    </a:prstGeom>
+                  </pic:spPr>
+                </pic:pic>
+              </a:graphicData>
+            </a:graphic>
+          </wp:inline>
+        </w:drawing>
+      </w:r>
+    </w:p>
+    <w:p>
+      <w:pPr>
+        <w:pStyle w:val="Caption"/>
+        <w:spacing w:line="360" w:lineRule="auto"/>
+        <w:rPr>
+          <w:rFonts w:cs="Times New Roman"/>
+          <w:sz w:val="24"/>
+          <w:szCs w:val="24"/>
+        </w:rPr>
+      </w:pPr>
+      <w:bookmarkStart w:id="99" w:name="_Toc233464082"/>
+      <w:r>
+        <w:t xml:space="preserve">Fig 8. </w:t>
+      </w:r>
+      <w:r>
+        <w:fldChar w:fldCharType="begin"/>
+      </w:r>
+      <w:r>
+        <w:instrText xml:space="preserve"> SEQ Fig_8. \* ARABIC </w:instrText>
+      </w:r>
+      <w:r>
+        <w:fldChar w:fldCharType="separate"/>
+      </w:r>
+      <w:r>
+        <w:rPr>
+          <w:noProof/>
+        </w:rPr>
+        <w:t>1</w:t>
+      </w:r>
+      <w:r>
+        <w:rPr>
+          <w:noProof/>
+        </w:rPr>
+        <w:fldChar w:fldCharType="end"/>
+      </w:r>
+      <w:r>
+        <w:t xml:space="preserve"> Sentiment Analysis: Positive review</w:t>
+      </w:r>
+      <w:bookmarkEnd w:id="99"/>
+    </w:p>
+    <w:p>
+      <w:pPr>
+        <w:tabs>
+          <w:tab w:val="left" w:pos="5205"/>
+        </w:tabs>
+        <w:spacing w:line="360" w:lineRule="auto"/>
+        <w:rPr>
+          <w:rFonts w:ascii="Times New Roman" w:hAnsi="Times New Roman" w:cs="Times New Roman"/>
+          <w:sz w:val="24"/>
+          <w:szCs w:val="24"/>
+        </w:rPr>
+      </w:pPr>
+      <w:r>
+        <w:rPr>
+          <w:rFonts w:ascii="Times New Roman" w:hAnsi="Times New Roman" w:cs="Times New Roman"/>
+          <w:sz w:val="24"/>
+          <w:szCs w:val="24"/>
+        </w:rPr>
+        <w:t>Fig. 8.1 above shows a positive sentiment review as classified by the transformer for sentiment analysis. The confidence of the classification being 99%.</w:t>
+      </w:r>
+    </w:p>
+    <w:p>
+      <w:pPr>
+        <w:pStyle w:val="Heading3"/>
+        <w:spacing w:line="360" w:lineRule="auto"/>
+      </w:pPr>
+      <w:bookmarkStart w:id="100" w:name="_Toc233464186"/>
+      <w:r>
+        <w:t>8.1.2 Negative Review</w:t>
+      </w:r>
+      <w:bookmarkEnd w:id="100"/>
+    </w:p>
+    <w:p>
+      <w:pPr>
+        <w:tabs>
+          <w:tab w:val="left" w:pos="5205"/>
+        </w:tabs>
+        <w:spacing w:line="360" w:lineRule="auto"/>
+        <w:rPr>
+          <w:rFonts w:ascii="Times New Roman" w:hAnsi="Times New Roman" w:cs="Times New Roman"/>
+          <w:sz w:val="24"/>
+          <w:szCs w:val="24"/>
+        </w:rPr>
+      </w:pPr>
+      <w:r>
+        <w:rPr>
+          <w:rFonts w:ascii="Times New Roman" w:hAnsi="Times New Roman" w:cs="Times New Roman"/>
+          <w:noProof/>
+          <w:sz w:val="24"/>
+          <w:szCs w:val="24"/>
+        </w:rPr>
+        <w:drawing>
+          <wp:inline distT="0" distB="0" distL="0" distR="0" wp14:anchorId="0EFE915E" wp14:editId="15EBF13A">
+            <wp:extent cx="5943600" cy="452120"/>
+            <wp:effectExtent l="0" t="0" r="0" b="5080"/>
+            <wp:docPr id="42" name="Picture 42"/>
+            <wp:cNvGraphicFramePr>
+              <a:graphicFrameLocks xmlns:a="http://schemas.openxmlformats.org/drawingml/2006/main" noChangeAspect="1"/>
+            </wp:cNvGraphicFramePr>
+            <a:graphic xmlns:a="http://schemas.openxmlformats.org/drawingml/2006/main">
+              <a:graphicData uri="http://schemas.openxmlformats.org/drawingml/2006/picture">
+                <pic:pic xmlns:pic="http://schemas.openxmlformats.org/drawingml/2006/picture">
+                  <pic:nvPicPr>
+                    <pic:cNvPr id="42" name="Picture 42"/>
+                    <pic:cNvPicPr/>
+                  </pic:nvPicPr>
+                  <pic:blipFill>
+                    <a:blip r:embed="rId53">
+                      <a:extLst>
+                        <a:ext uri="{28A0092B-C50C-407E-A947-70E740481C1C}">
+                          <a14:useLocalDpi xmlns:a14="http://schemas.microsoft.com/office/drawing/2010/main" val="0"/>
+                        </a:ext>
+                      </a:extLst>
+                    </a:blip>
+                    <a:stretch>
+                      <a:fillRect/>
+                    </a:stretch>
+                  </pic:blipFill>
+                  <pic:spPr>
+                    <a:xfrm>
+                      <a:off x="0" y="0"/>
+                      <a:ext cx="5943600" cy="452120"/>
+                    </a:xfrm>
+                    <a:prstGeom prst="rect">
+                      <a:avLst/>
+                    </a:prstGeom>
+                  </pic:spPr>
+                </pic:pic>
+              </a:graphicData>
+            </a:graphic>
+          </wp:inline>
+        </w:drawing>
+      </w:r>
+    </w:p>
+    <w:p>
+      <w:pPr>
+        <w:pStyle w:val="Caption"/>
+        <w:spacing w:line="360" w:lineRule="auto"/>
+        <w:rPr>
+          <w:rFonts w:cs="Times New Roman"/>
+          <w:sz w:val="24"/>
+          <w:szCs w:val="24"/>
+        </w:rPr>
+      </w:pPr>
+      <w:bookmarkStart w:id="101" w:name="_Toc233464083"/>
+      <w:r>
+        <w:t xml:space="preserve">Fig 8. </w:t>
+      </w:r>
+      <w:r>
+        <w:fldChar w:fldCharType="begin"/>
+      </w:r>
+      <w:r>
+        <w:instrText xml:space="preserve"> SEQ Fig_8. \* ARABIC </w:instrText>
+      </w:r>
+      <w:r>
+        <w:fldChar w:fldCharType="separate"/>
+      </w:r>
+      <w:r>
+        <w:rPr>
+          <w:noProof/>
+        </w:rPr>
+        <w:t>2</w:t>
+      </w:r>
+      <w:r>
+        <w:rPr>
+          <w:noProof/>
+        </w:rPr>
+        <w:fldChar w:fldCharType="end"/>
+      </w:r>
+      <w:r>
+        <w:t xml:space="preserve"> Sentiment Analysis: Negative review</w:t>
+      </w:r>
+      <w:bookmarkEnd w:id="101"/>
+    </w:p>
+    <w:p>
+      <w:pPr>
+        <w:tabs>
+          <w:tab w:val="left" w:pos="5205"/>
+        </w:tabs>
+        <w:spacing w:line="360" w:lineRule="auto"/>
+        <w:rPr>
+          <w:rFonts w:ascii="Times New Roman" w:hAnsi="Times New Roman" w:cs="Times New Roman"/>
+          <w:sz w:val="24"/>
+          <w:szCs w:val="24"/>
+        </w:rPr>
+      </w:pPr>
+      <w:r>
+        <w:rPr>
+          <w:rFonts w:ascii="Times New Roman" w:hAnsi="Times New Roman" w:cs="Times New Roman"/>
+          <w:sz w:val="24"/>
+          <w:szCs w:val="24"/>
+        </w:rPr>
+        <w:t>Fig. 8.2 shows a negative sentiment review as classified by the transformer for sentiment analysis, at a score of 99%.</w:t>
+      </w:r>
+    </w:p>
+    <w:p>
+      <w:pPr>
+        <w:pStyle w:val="Heading3"/>
+        <w:spacing w:line="360" w:lineRule="auto"/>
+      </w:pPr>
+      <w:bookmarkStart w:id="102" w:name="_Toc233464187"/>
+      <w:r>
+        <w:t>8.1.3 Neutral Review</w:t>
+      </w:r>
+      <w:bookmarkEnd w:id="102"/>
+    </w:p>
+    <w:p>
+      <w:pPr>
+        <w:tabs>
+          <w:tab w:val="left" w:pos="5205"/>
+        </w:tabs>
+        <w:spacing w:line="360" w:lineRule="auto"/>
+        <w:rPr>
+          <w:rFonts w:ascii="Times New Roman" w:hAnsi="Times New Roman" w:cs="Times New Roman"/>
+          <w:sz w:val="24"/>
+          <w:szCs w:val="24"/>
+        </w:rPr>
+      </w:pPr>
+      <w:r>
+        <w:rPr>
+          <w:rFonts w:ascii="Times New Roman" w:hAnsi="Times New Roman" w:cs="Times New Roman"/>
+          <w:noProof/>
+          <w:sz w:val="24"/>
+          <w:szCs w:val="24"/>
+        </w:rPr>
+        <w:drawing>
+          <wp:inline distT="0" distB="0" distL="0" distR="0" wp14:anchorId="299AB9AD" wp14:editId="6C62065F">
+            <wp:extent cx="5943600" cy="466090"/>
+            <wp:effectExtent l="0" t="0" r="0" b="0"/>
+            <wp:docPr id="43" name="Picture 43"/>
+            <wp:cNvGraphicFramePr>
+              <a:graphicFrameLocks xmlns:a="http://schemas.openxmlformats.org/drawingml/2006/main" noChangeAspect="1"/>
+            </wp:cNvGraphicFramePr>
+            <a:graphic xmlns:a="http://schemas.openxmlformats.org/drawingml/2006/main">
+              <a:graphicData uri="http://schemas.openxmlformats.org/drawingml/2006/picture">
+                <pic:pic xmlns:pic="http://schemas.openxmlformats.org/drawingml/2006/picture">
+                  <pic:nvPicPr>
+                    <pic:cNvPr id="43" name="Picture 43"/>
+                    <pic:cNvPicPr/>
+                  </pic:nvPicPr>
+                  <pic:blipFill>
+                    <a:blip r:embed="rId54">
+                      <a:extLst>
+                        <a:ext uri="{28A0092B-C50C-407E-A947-70E740481C1C}">
+                          <a14:useLocalDpi xmlns:a14="http://schemas.microsoft.com/office/drawing/2010/main" val="0"/>
+                        </a:ext>
+                      </a:extLst>
+                    </a:blip>
+                    <a:stretch>
+                      <a:fillRect/>
+                    </a:stretch>
+                  </pic:blipFill>
+                  <pic:spPr>
+                    <a:xfrm>
+                      <a:off x="0" y="0"/>
+                      <a:ext cx="5943600" cy="466090"/>
+                    </a:xfrm>
+                    <a:prstGeom prst="rect">
+                      <a:avLst/>
+                    </a:prstGeom>
+                  </pic:spPr>
+                </pic:pic>
+              </a:graphicData>
+            </a:graphic>
+          </wp:inline>
+        </w:drawing>
+      </w:r>
+    </w:p>
+    <w:p>
+      <w:pPr>
+        <w:pStyle w:val="Caption"/>
+        <w:spacing w:line="360" w:lineRule="auto"/>
+        <w:rPr>
+          <w:rFonts w:cs="Times New Roman"/>
+          <w:sz w:val="24"/>
+          <w:szCs w:val="24"/>
+        </w:rPr>
+      </w:pPr>
+      <w:bookmarkStart w:id="103" w:name="_Toc233464084"/>
+      <w:r>
+        <w:t xml:space="preserve">Fig 8. </w:t>
+      </w:r>
+      <w:r>
+        <w:fldChar w:fldCharType="begin"/>
+      </w:r>
+      <w:r>
+        <w:instrText xml:space="preserve"> SEQ Fi</w:instrText>
+      </w:r>
+      <w:r>
+        <w:instrText xml:space="preserve">g_8. \* ARABIC </w:instrText>
+      </w:r>
+      <w:r>
+        <w:fldChar w:fldCharType="separate"/>
+      </w:r>
+      <w:r>
+        <w:rPr>
+          <w:noProof/>
+        </w:rPr>
+        <w:t>3</w:t>
+      </w:r>
+      <w:r>
+        <w:rPr>
+          <w:noProof/>
+        </w:rPr>
+        <w:fldChar w:fldCharType="end"/>
+      </w:r>
+      <w:r>
+        <w:t xml:space="preserve"> Sentiment Analysis: Neutral review</w:t>
+      </w:r>
+      <w:bookmarkEnd w:id="103"/>
+    </w:p>
+    <w:p>
+      <w:pPr>
+        <w:tabs>
+          <w:tab w:val="left" w:pos="5205"/>
+        </w:tabs>
+        <w:spacing w:line="360" w:lineRule="auto"/>
+        <w:rPr>
+          <w:rFonts w:ascii="Times New Roman" w:hAnsi="Times New Roman" w:cs="Times New Roman"/>
+          <w:sz w:val="24"/>
+          <w:szCs w:val="24"/>
+        </w:rPr>
+      </w:pPr>
+      <w:r>
+        <w:rPr>
+          <w:rFonts w:ascii="Times New Roman" w:hAnsi="Times New Roman" w:cs="Times New Roman"/>
+          <w:sz w:val="24"/>
+          <w:szCs w:val="24"/>
+        </w:rPr>
+        <w:t>Fig. 8.3 shows a neutral sentiment review of 81% score, as classified by the sentiment analysis transformer model.</w:t>
+      </w:r>
+    </w:p>
+    <w:p>
+      <w:pPr>
+        <w:pStyle w:val="Heading2"/>
+        <w:spacing w:line="360" w:lineRule="auto"/>
+      </w:pPr>
+      <w:bookmarkStart w:id="104" w:name="_Toc233464188"/>
+      <w:r>
+        <w:lastRenderedPageBreak/>
+        <w:t>8.2 Text Generation</w:t>
+      </w:r>
+      <w:bookmarkEnd w:id="104"/>
+    </w:p>
+    <w:p>
+      <w:pPr>
+        <w:tabs>
+          <w:tab w:val="left" w:pos="5205"/>
+        </w:tabs>
+        <w:spacing w:line="360" w:lineRule="auto"/>
+        <w:rPr>
+          <w:rFonts w:ascii="Times New Roman" w:hAnsi="Times New Roman" w:cs="Times New Roman"/>
+          <w:noProof/>
+          <w:sz w:val="24"/>
+          <w:szCs w:val="24"/>
+        </w:rPr>
+      </w:pPr>
+      <w:r>
+        <w:rPr>
+          <w:rFonts w:ascii="Times New Roman" w:hAnsi="Times New Roman" w:cs="Times New Roman"/>
+          <w:noProof/>
+          <w:sz w:val="24"/>
+          <w:szCs w:val="24"/>
+        </w:rPr>
+        <w:drawing>
+          <wp:inline distT="0" distB="0" distL="0" distR="0" wp14:anchorId="674442ED" wp14:editId="4EBED972">
+            <wp:extent cx="5943600" cy="2067560"/>
+            <wp:effectExtent l="0" t="0" r="0" b="8890"/>
+            <wp:docPr id="44" name="Picture 44"/>
+            <wp:cNvGraphicFramePr>
+              <a:graphicFrameLocks xmlns:a="http://schemas.openxmlformats.org/drawingml/2006/main" noChangeAspect="1"/>
+            </wp:cNvGraphicFramePr>
+            <a:graphic xmlns:a="http://schemas.openxmlformats.org/drawingml/2006/main">
+              <a:graphicData uri="http://schemas.openxmlformats.org/drawingml/2006/picture">
+                <pic:pic xmlns:pic="http://schemas.openxmlformats.org/drawingml/2006/picture">
+                  <pic:nvPicPr>
+                    <pic:cNvPr id="44" name="Picture 44"/>
+                    <pic:cNvPicPr/>
+                  </pic:nvPicPr>
+                  <pic:blipFill>
+                    <a:blip r:embed="rId55">
+                      <a:extLst>
+                        <a:ext uri="{28A0092B-C50C-407E-A947-70E740481C1C}">
+                          <a14:useLocalDpi xmlns:a14="http://schemas.microsoft.com/office/drawing/2010/main" val="0"/>
+                        </a:ext>
+                      </a:extLst>
+                    </a:blip>
+                    <a:stretch>
+                      <a:fillRect/>
+                    </a:stretch>
+                  </pic:blipFill>
+                  <pic:spPr>
+                    <a:xfrm>
+                      <a:off x="0" y="0"/>
+                      <a:ext cx="5943600" cy="2067560"/>
+                    </a:xfrm>
+                    <a:prstGeom prst="rect">
+                      <a:avLst/>
+                    </a:prstGeom>
+                  </pic:spPr>
+                </pic:pic>
+              </a:graphicData>
+            </a:graphic>
+          </wp:inline>
+        </w:drawing>
+      </w:r>
+    </w:p>
+    <w:p>
+      <w:pPr>
+        <w:pStyle w:val="Caption"/>
+        <w:spacing w:line="360" w:lineRule="auto"/>
+      </w:pPr>
+      <w:bookmarkStart w:id="105" w:name="_Toc233464085"/>
+      <w:r>
+        <w:t xml:space="preserve">Fig 8. </w:t>
+      </w:r>
+      <w:r>
+        <w:fldChar w:fldCharType="begin"/>
+      </w:r>
+      <w:r>
+        <w:instrText xml:space="preserve"> SEQ Fig_8. \* ARABIC </w:instrText>
+      </w:r>
+      <w:r>
+        <w:fldChar w:fldCharType="separate"/>
+      </w:r>
+      <w:r>
+        <w:rPr>
+          <w:noProof/>
+        </w:rPr>
+        <w:t>4</w:t>
+      </w:r>
+      <w:r>
+        <w:rPr>
+          <w:noProof/>
+        </w:rPr>
+        <w:fldChar w:fldCharType="end"/>
+      </w:r>
+      <w:r>
+        <w:t xml:space="preserve"> Text generation using transformers</w:t>
+      </w:r>
+      <w:bookmarkEnd w:id="105"/>
+    </w:p>
+    <w:p>
+      <w:pPr>
+        <w:tabs>
+          <w:tab w:val="left" w:pos="3720"/>
+        </w:tabs>
+        <w:spacing w:line="360" w:lineRule="auto"/>
+        <w:rPr>
+          <w:rFonts w:ascii="Times New Roman" w:hAnsi="Times New Roman" w:cs="Times New Roman"/>
+          <w:sz w:val="24"/>
+          <w:szCs w:val="24"/>
+        </w:rPr>
+      </w:pPr>
+      <w:r>
+        <w:rPr>
+          <w:rFonts w:ascii="Times New Roman" w:hAnsi="Times New Roman" w:cs="Times New Roman"/>
+          <w:sz w:val="24"/>
+          <w:szCs w:val="24"/>
+        </w:rPr>
+        <w:t xml:space="preserve">Fig. 8.4 above shows text completion by the </w:t>
+      </w:r>
+      <w:proofErr w:type="spellStart"/>
+      <w:r>
+        <w:rPr>
+          <w:rFonts w:ascii="Times New Roman" w:hAnsi="Times New Roman" w:cs="Times New Roman"/>
+          <w:sz w:val="24"/>
+          <w:szCs w:val="24"/>
+        </w:rPr>
+        <w:t>HuggingFace</w:t>
+      </w:r>
+      <w:proofErr w:type="spellEnd"/>
+      <w:r>
+        <w:rPr>
+          <w:rFonts w:ascii="Times New Roman" w:hAnsi="Times New Roman" w:cs="Times New Roman"/>
+          <w:sz w:val="24"/>
+          <w:szCs w:val="24"/>
+        </w:rPr>
+        <w:t xml:space="preserve"> Transformer Models. The model completes the statement by the user as provided in the prompt.</w:t>
       </w:r>
     </w:p>
     <w:sectPr>

</xml_diff>